<commit_message>
Bai tap Tuan 04
</commit_message>
<xml_diff>
--- a/22001745_NguyenQuocBao_Tuan04.docx
+++ b/22001745_NguyenQuocBao_Tuan04.docx
@@ -1,6 +1,6 @@
 
 <file path=word/document.xml><?xml version="1.0" encoding="utf-8"?>
-<w:document xmlns:wpc="http://schemas.microsoft.com/office/word/2010/wordprocessingCanvas" xmlns:mc="http://schemas.openxmlformats.org/markup-compatibility/2006" xmlns:o="urn:schemas-microsoft-com:office:office" xmlns:r="http://schemas.openxmlformats.org/officeDocument/2006/relationships" xmlns:m="http://schemas.openxmlformats.org/officeDocument/2006/math" xmlns:v="urn:schemas-microsoft-com:vml" xmlns:wp14="http://schemas.microsoft.com/office/word/2010/wordprocessingDrawing" xmlns:wp="http://schemas.openxmlformats.org/drawingml/2006/wordprocessingDrawing" xmlns:w10="urn:schemas-microsoft-com:office:word" xmlns:w="http://schemas.openxmlformats.org/wordprocessingml/2006/main" xmlns:w14="http://schemas.microsoft.com/office/word/2010/wordml" xmlns:w15="http://schemas.microsoft.com/office/word/2012/wordml" xmlns:wpg="http://schemas.microsoft.com/office/word/2010/wordprocessingGroup" xmlns:wpi="http://schemas.microsoft.com/office/word/2010/wordprocessingInk" xmlns:wne="http://schemas.microsoft.com/office/word/2006/wordml" xmlns:wps="http://schemas.microsoft.com/office/word/2010/wordprocessingShape" mc:Ignorable="w14 w15 wp14">
+<w:document xmlns:wpc="http://schemas.microsoft.com/office/word/2010/wordprocessingCanvas" xmlns:cx="http://schemas.microsoft.com/office/drawing/2014/chartex" xmlns:cx1="http://schemas.microsoft.com/office/drawing/2015/9/8/chartex" xmlns:cx2="http://schemas.microsoft.com/office/drawing/2015/10/21/chartex" xmlns:cx3="http://schemas.microsoft.com/office/drawing/2016/5/9/chartex" xmlns:cx4="http://schemas.microsoft.com/office/drawing/2016/5/10/chartex" xmlns:cx5="http://schemas.microsoft.com/office/drawing/2016/5/11/chartex" xmlns:cx6="http://schemas.microsoft.com/office/drawing/2016/5/12/chartex" xmlns:cx7="http://schemas.microsoft.com/office/drawing/2016/5/13/chartex" xmlns:cx8="http://schemas.microsoft.com/office/drawing/2016/5/14/chartex" xmlns:mc="http://schemas.openxmlformats.org/markup-compatibility/2006" xmlns:aink="http://schemas.microsoft.com/office/drawing/2016/ink" xmlns:am3d="http://schemas.microsoft.com/office/drawing/2017/model3d" xmlns:o="urn:schemas-microsoft-com:office:office" xmlns:oel="http://schemas.microsoft.com/office/2019/extlst" xmlns:r="http://schemas.openxmlformats.org/officeDocument/2006/relationships" xmlns:m="http://schemas.openxmlformats.org/officeDocument/2006/math" xmlns:v="urn:schemas-microsoft-com:vml" xmlns:wp14="http://schemas.microsoft.com/office/word/2010/wordprocessingDrawing" xmlns:wp="http://schemas.openxmlformats.org/drawingml/2006/wordprocessingDrawing" xmlns:w10="urn:schemas-microsoft-com:office:word" xmlns:w="http://schemas.openxmlformats.org/wordprocessingml/2006/main" xmlns:w14="http://schemas.microsoft.com/office/word/2010/wordml" xmlns:w15="http://schemas.microsoft.com/office/word/2012/wordml" xmlns:w16cex="http://schemas.microsoft.com/office/word/2018/wordml/cex" xmlns:w16cid="http://schemas.microsoft.com/office/word/2016/wordml/cid" xmlns:w16="http://schemas.microsoft.com/office/word/2018/wordml" xmlns:w16sdtdh="http://schemas.microsoft.com/office/word/2020/wordml/sdtdatahash" xmlns:w16se="http://schemas.microsoft.com/office/word/2015/wordml/symex" xmlns:wpg="http://schemas.microsoft.com/office/word/2010/wordprocessingGroup" xmlns:wpi="http://schemas.microsoft.com/office/word/2010/wordprocessingInk" xmlns:wne="http://schemas.microsoft.com/office/word/2006/wordml" xmlns:wps="http://schemas.microsoft.com/office/word/2010/wordprocessingShape" mc:Ignorable="w14 w15 w16se w16cid w16 w16cex w16sdtdh wp14">
   <w:body>
     <w:p>
       <w:pPr>
@@ -18,27 +18,7 @@
           <w:sz w:val="26"/>
           <w:szCs w:val="26"/>
         </w:rPr>
-        <w:t xml:space="preserve">Ho </w:t>
-      </w:r>
-      <w:proofErr w:type="gramStart"/>
-      <w:r>
-        <w:rPr>
-          <w:rFonts w:ascii="Times New Roman" w:hAnsi="Times New Roman" w:cs="Times New Roman"/>
-          <w:b/>
-          <w:sz w:val="26"/>
-          <w:szCs w:val="26"/>
-        </w:rPr>
-        <w:t>va</w:t>
-      </w:r>
-      <w:proofErr w:type="gramEnd"/>
-      <w:r>
-        <w:rPr>
-          <w:rFonts w:ascii="Times New Roman" w:hAnsi="Times New Roman" w:cs="Times New Roman"/>
-          <w:b/>
-          <w:sz w:val="26"/>
-          <w:szCs w:val="26"/>
-        </w:rPr>
-        <w:t xml:space="preserve"> ten: Nguyen Quoc Bao</w:t>
+        <w:t>Ho va ten: Nguyen Quoc Bao</w:t>
       </w:r>
     </w:p>
     <w:p>
@@ -149,11 +129,12 @@
       <w:r>
         <w:rPr>
           <w:rFonts w:ascii="Times New Roman" w:hAnsi="Times New Roman" w:cs="Times New Roman"/>
+          <w:noProof/>
           <w:sz w:val="26"/>
           <w:szCs w:val="26"/>
         </w:rPr>
         <w:drawing>
-          <wp:inline distT="0" distB="0" distL="0" distR="0" wp14:anchorId="0E654E5C" wp14:editId="37025BC3">
+          <wp:inline distT="0" distB="0" distL="0" distR="0" wp14:anchorId="302F7762" wp14:editId="2803C4F8">
             <wp:extent cx="4972744" cy="752580"/>
             <wp:effectExtent l="0" t="0" r="0" b="9525"/>
             <wp:docPr id="1" name="Picture 1"/>
@@ -231,11 +212,12 @@
       <w:r>
         <w:rPr>
           <w:rFonts w:ascii="Times New Roman" w:hAnsi="Times New Roman" w:cs="Times New Roman"/>
+          <w:noProof/>
           <w:sz w:val="26"/>
           <w:szCs w:val="26"/>
         </w:rPr>
         <w:drawing>
-          <wp:inline distT="0" distB="0" distL="0" distR="0" wp14:anchorId="446954A2" wp14:editId="0AE0FE65">
+          <wp:inline distT="0" distB="0" distL="0" distR="0" wp14:anchorId="33A813D2" wp14:editId="520D1BD5">
             <wp:extent cx="5943600" cy="3987165"/>
             <wp:effectExtent l="0" t="0" r="0" b="0"/>
             <wp:docPr id="2" name="Picture 2"/>
@@ -283,11 +265,12 @@
       <w:r>
         <w:rPr>
           <w:rFonts w:ascii="Times New Roman" w:hAnsi="Times New Roman" w:cs="Times New Roman"/>
+          <w:noProof/>
           <w:sz w:val="26"/>
           <w:szCs w:val="26"/>
         </w:rPr>
         <w:drawing>
-          <wp:inline distT="0" distB="0" distL="0" distR="0" wp14:anchorId="235F602C" wp14:editId="7DF6C371">
+          <wp:inline distT="0" distB="0" distL="0" distR="0" wp14:anchorId="5BF18B3A" wp14:editId="5C770989">
             <wp:extent cx="5943600" cy="652145"/>
             <wp:effectExtent l="0" t="0" r="0" b="0"/>
             <wp:docPr id="3" name="Picture 3"/>
@@ -386,11 +369,12 @@
       <w:r>
         <w:rPr>
           <w:rFonts w:ascii="Times New Roman" w:hAnsi="Times New Roman" w:cs="Times New Roman"/>
+          <w:noProof/>
           <w:sz w:val="26"/>
           <w:szCs w:val="26"/>
         </w:rPr>
         <w:drawing>
-          <wp:inline distT="0" distB="0" distL="0" distR="0" wp14:anchorId="1DA88152" wp14:editId="32165F1C">
+          <wp:inline distT="0" distB="0" distL="0" distR="0" wp14:anchorId="5DB5A1F6" wp14:editId="1C13485D">
             <wp:extent cx="5943600" cy="2061845"/>
             <wp:effectExtent l="0" t="0" r="0" b="0"/>
             <wp:docPr id="4" name="Picture 4"/>
@@ -438,11 +422,12 @@
       <w:r>
         <w:rPr>
           <w:rFonts w:ascii="Times New Roman" w:hAnsi="Times New Roman" w:cs="Times New Roman"/>
+          <w:noProof/>
           <w:sz w:val="26"/>
           <w:szCs w:val="26"/>
         </w:rPr>
         <w:drawing>
-          <wp:inline distT="0" distB="0" distL="0" distR="0" wp14:anchorId="51E514DF" wp14:editId="48DB8385">
+          <wp:inline distT="0" distB="0" distL="0" distR="0" wp14:anchorId="2ACBE424" wp14:editId="6AFBF013">
             <wp:extent cx="5943600" cy="479425"/>
             <wp:effectExtent l="0" t="0" r="0" b="0"/>
             <wp:docPr id="5" name="Picture 5"/>
@@ -520,11 +505,12 @@
       <w:r>
         <w:rPr>
           <w:rFonts w:ascii="Times New Roman" w:hAnsi="Times New Roman" w:cs="Times New Roman"/>
+          <w:noProof/>
           <w:sz w:val="26"/>
           <w:szCs w:val="26"/>
         </w:rPr>
         <w:drawing>
-          <wp:inline distT="0" distB="0" distL="0" distR="0" wp14:anchorId="61728E8B" wp14:editId="5E0A18B9">
+          <wp:inline distT="0" distB="0" distL="0" distR="0" wp14:anchorId="5E35EF2E" wp14:editId="56258F4D">
             <wp:extent cx="5496692" cy="724001"/>
             <wp:effectExtent l="0" t="0" r="8890" b="0"/>
             <wp:docPr id="6" name="Picture 6"/>
@@ -602,11 +588,12 @@
       <w:r>
         <w:rPr>
           <w:rFonts w:ascii="Times New Roman" w:hAnsi="Times New Roman" w:cs="Times New Roman"/>
+          <w:noProof/>
           <w:sz w:val="26"/>
           <w:szCs w:val="26"/>
         </w:rPr>
         <w:drawing>
-          <wp:inline distT="0" distB="0" distL="0" distR="0" wp14:anchorId="37A0076A" wp14:editId="263AB1DF">
+          <wp:inline distT="0" distB="0" distL="0" distR="0" wp14:anchorId="79F763C5" wp14:editId="22BB84DD">
             <wp:extent cx="5372850" cy="562053"/>
             <wp:effectExtent l="0" t="0" r="0" b="9525"/>
             <wp:docPr id="7" name="Picture 7"/>
@@ -654,11 +641,12 @@
       <w:r>
         <w:rPr>
           <w:rFonts w:ascii="Times New Roman" w:hAnsi="Times New Roman" w:cs="Times New Roman"/>
+          <w:noProof/>
           <w:sz w:val="26"/>
           <w:szCs w:val="26"/>
         </w:rPr>
         <w:drawing>
-          <wp:inline distT="0" distB="0" distL="0" distR="0" wp14:anchorId="271629A2" wp14:editId="48E7ED3B">
+          <wp:inline distT="0" distB="0" distL="0" distR="0" wp14:anchorId="0EE4D559" wp14:editId="7BD9809C">
             <wp:extent cx="5943600" cy="288290"/>
             <wp:effectExtent l="0" t="0" r="0" b="0"/>
             <wp:docPr id="8" name="Picture 8"/>
@@ -736,11 +724,12 @@
       <w:r>
         <w:rPr>
           <w:rFonts w:ascii="Times New Roman" w:hAnsi="Times New Roman" w:cs="Times New Roman"/>
+          <w:noProof/>
           <w:sz w:val="26"/>
           <w:szCs w:val="26"/>
         </w:rPr>
         <w:drawing>
-          <wp:inline distT="0" distB="0" distL="0" distR="0" wp14:anchorId="6FCFBA77" wp14:editId="3171D8B0">
+          <wp:inline distT="0" distB="0" distL="0" distR="0" wp14:anchorId="6227D33C" wp14:editId="2CDF9AA9">
             <wp:extent cx="5943600" cy="401955"/>
             <wp:effectExtent l="0" t="0" r="0" b="0"/>
             <wp:docPr id="9" name="Picture 9"/>
@@ -818,11 +807,12 @@
       <w:r>
         <w:rPr>
           <w:rFonts w:ascii="Times New Roman" w:hAnsi="Times New Roman" w:cs="Times New Roman"/>
+          <w:noProof/>
           <w:sz w:val="26"/>
           <w:szCs w:val="26"/>
         </w:rPr>
         <w:drawing>
-          <wp:inline distT="0" distB="0" distL="0" distR="0" wp14:anchorId="10A6D63D" wp14:editId="56AC100B">
+          <wp:inline distT="0" distB="0" distL="0" distR="0" wp14:anchorId="193D1486" wp14:editId="574904F6">
             <wp:extent cx="5943600" cy="418465"/>
             <wp:effectExtent l="0" t="0" r="0" b="635"/>
             <wp:docPr id="10" name="Picture 10"/>
@@ -931,11 +921,12 @@
       <w:r>
         <w:rPr>
           <w:rFonts w:ascii="Times New Roman" w:hAnsi="Times New Roman" w:cs="Times New Roman"/>
+          <w:noProof/>
           <w:sz w:val="26"/>
           <w:szCs w:val="26"/>
         </w:rPr>
         <w:drawing>
-          <wp:inline distT="0" distB="0" distL="0" distR="0" wp14:anchorId="3D04CC40" wp14:editId="17BD6E75">
+          <wp:inline distT="0" distB="0" distL="0" distR="0" wp14:anchorId="2750389F" wp14:editId="4B98EAC7">
             <wp:extent cx="5943600" cy="3416935"/>
             <wp:effectExtent l="0" t="0" r="0" b="0"/>
             <wp:docPr id="11" name="Picture 11"/>
@@ -1013,11 +1004,12 @@
       <w:r>
         <w:rPr>
           <w:rFonts w:ascii="Times New Roman" w:hAnsi="Times New Roman" w:cs="Times New Roman"/>
+          <w:noProof/>
           <w:sz w:val="26"/>
           <w:szCs w:val="26"/>
         </w:rPr>
         <w:drawing>
-          <wp:inline distT="0" distB="0" distL="0" distR="0" wp14:anchorId="27073CCC" wp14:editId="6C9BF431">
+          <wp:inline distT="0" distB="0" distL="0" distR="0" wp14:anchorId="4473A4EA" wp14:editId="238A8FEF">
             <wp:extent cx="5943600" cy="3539490"/>
             <wp:effectExtent l="0" t="0" r="0" b="3810"/>
             <wp:docPr id="12" name="Picture 12"/>
@@ -1106,11 +1098,12 @@
       <w:r>
         <w:rPr>
           <w:rFonts w:ascii="Times New Roman" w:hAnsi="Times New Roman" w:cs="Times New Roman"/>
+          <w:noProof/>
           <w:sz w:val="26"/>
           <w:szCs w:val="26"/>
         </w:rPr>
         <w:drawing>
-          <wp:inline distT="0" distB="0" distL="0" distR="0" wp14:anchorId="5C1F7E96" wp14:editId="77F1744A">
+          <wp:inline distT="0" distB="0" distL="0" distR="0" wp14:anchorId="15C07F05" wp14:editId="14D5A954">
             <wp:extent cx="5943600" cy="489585"/>
             <wp:effectExtent l="0" t="0" r="0" b="5715"/>
             <wp:docPr id="13" name="Picture 13"/>
@@ -1158,11 +1151,12 @@
       <w:r>
         <w:rPr>
           <w:rFonts w:ascii="Times New Roman" w:hAnsi="Times New Roman" w:cs="Times New Roman"/>
+          <w:noProof/>
           <w:sz w:val="26"/>
           <w:szCs w:val="26"/>
         </w:rPr>
         <w:drawing>
-          <wp:inline distT="0" distB="0" distL="0" distR="0" wp14:anchorId="53E8E33C" wp14:editId="5E437BD4">
+          <wp:inline distT="0" distB="0" distL="0" distR="0" wp14:anchorId="63CDAC11" wp14:editId="644EFCFD">
             <wp:extent cx="5943600" cy="269875"/>
             <wp:effectExtent l="0" t="0" r="0" b="0"/>
             <wp:docPr id="14" name="Picture 14"/>
@@ -1240,11 +1234,12 @@
       <w:r>
         <w:rPr>
           <w:rFonts w:ascii="Times New Roman" w:hAnsi="Times New Roman" w:cs="Times New Roman"/>
+          <w:noProof/>
           <w:sz w:val="26"/>
           <w:szCs w:val="26"/>
         </w:rPr>
         <w:drawing>
-          <wp:inline distT="0" distB="0" distL="0" distR="0" wp14:anchorId="37CEAA0D" wp14:editId="5458E7ED">
+          <wp:inline distT="0" distB="0" distL="0" distR="0" wp14:anchorId="454C5691" wp14:editId="1CA1DEA8">
             <wp:extent cx="5449060" cy="352474"/>
             <wp:effectExtent l="0" t="0" r="0" b="9525"/>
             <wp:docPr id="15" name="Picture 15"/>
@@ -1292,11 +1287,12 @@
       <w:r>
         <w:rPr>
           <w:rFonts w:ascii="Times New Roman" w:hAnsi="Times New Roman" w:cs="Times New Roman"/>
+          <w:noProof/>
           <w:sz w:val="26"/>
           <w:szCs w:val="26"/>
         </w:rPr>
         <w:drawing>
-          <wp:inline distT="0" distB="0" distL="0" distR="0" wp14:anchorId="22F6ACA4" wp14:editId="1DF3CEA8">
+          <wp:inline distT="0" distB="0" distL="0" distR="0" wp14:anchorId="08E78EAE" wp14:editId="36594CCE">
             <wp:extent cx="5943600" cy="274320"/>
             <wp:effectExtent l="0" t="0" r="0" b="0"/>
             <wp:docPr id="16" name="Picture 16"/>
@@ -1374,11 +1370,12 @@
       <w:r>
         <w:rPr>
           <w:rFonts w:ascii="Times New Roman" w:hAnsi="Times New Roman" w:cs="Times New Roman"/>
+          <w:noProof/>
           <w:sz w:val="26"/>
           <w:szCs w:val="26"/>
         </w:rPr>
         <w:drawing>
-          <wp:inline distT="0" distB="0" distL="0" distR="0" wp14:anchorId="202B6121" wp14:editId="77DB990E">
+          <wp:inline distT="0" distB="0" distL="0" distR="0" wp14:anchorId="1AE43907" wp14:editId="406C923E">
             <wp:extent cx="5515745" cy="657317"/>
             <wp:effectExtent l="0" t="0" r="0" b="9525"/>
             <wp:docPr id="17" name="Picture 17"/>
@@ -1426,11 +1423,12 @@
       <w:r>
         <w:rPr>
           <w:rFonts w:ascii="Times New Roman" w:hAnsi="Times New Roman" w:cs="Times New Roman"/>
+          <w:noProof/>
           <w:sz w:val="26"/>
           <w:szCs w:val="26"/>
         </w:rPr>
         <w:drawing>
-          <wp:inline distT="0" distB="0" distL="0" distR="0" wp14:anchorId="4701D365" wp14:editId="2DCA928C">
+          <wp:inline distT="0" distB="0" distL="0" distR="0" wp14:anchorId="2033200E" wp14:editId="64617028">
             <wp:extent cx="5476875" cy="834989"/>
             <wp:effectExtent l="0" t="0" r="0" b="3810"/>
             <wp:docPr id="18" name="Picture 18"/>
@@ -1508,11 +1506,12 @@
       <w:r>
         <w:rPr>
           <w:rFonts w:ascii="Times New Roman" w:hAnsi="Times New Roman" w:cs="Times New Roman"/>
+          <w:noProof/>
           <w:sz w:val="26"/>
           <w:szCs w:val="26"/>
         </w:rPr>
         <w:drawing>
-          <wp:inline distT="0" distB="0" distL="0" distR="0" wp14:anchorId="3874AD3C" wp14:editId="3B8C7AEA">
+          <wp:inline distT="0" distB="0" distL="0" distR="0" wp14:anchorId="09189BC8" wp14:editId="101CF4B1">
             <wp:extent cx="5010150" cy="1083927"/>
             <wp:effectExtent l="0" t="0" r="0" b="2540"/>
             <wp:docPr id="19" name="Picture 19"/>
@@ -1582,11 +1581,12 @@
       <w:r>
         <w:rPr>
           <w:rFonts w:ascii="Times New Roman" w:hAnsi="Times New Roman" w:cs="Times New Roman"/>
+          <w:noProof/>
           <w:sz w:val="26"/>
           <w:szCs w:val="26"/>
         </w:rPr>
         <w:drawing>
-          <wp:inline distT="0" distB="0" distL="0" distR="0" wp14:anchorId="010C368C" wp14:editId="65F545D2">
+          <wp:inline distT="0" distB="0" distL="0" distR="0" wp14:anchorId="41E3E425" wp14:editId="5EB441F8">
             <wp:extent cx="5943600" cy="1638935"/>
             <wp:effectExtent l="0" t="0" r="0" b="0"/>
             <wp:docPr id="20" name="Picture 20"/>
@@ -1673,11 +1673,12 @@
       <w:r>
         <w:rPr>
           <w:rFonts w:ascii="Times New Roman" w:hAnsi="Times New Roman" w:cs="Times New Roman"/>
+          <w:noProof/>
           <w:sz w:val="26"/>
           <w:szCs w:val="26"/>
         </w:rPr>
         <w:drawing>
-          <wp:inline distT="0" distB="0" distL="0" distR="0" wp14:anchorId="64A78792" wp14:editId="164A90DE">
+          <wp:inline distT="0" distB="0" distL="0" distR="0" wp14:anchorId="4453C1D4" wp14:editId="5C3FA9B8">
             <wp:extent cx="5248275" cy="1236933"/>
             <wp:effectExtent l="0" t="0" r="0" b="1905"/>
             <wp:docPr id="21" name="Picture 21"/>
@@ -1755,11 +1756,12 @@
       <w:r>
         <w:rPr>
           <w:rFonts w:ascii="Times New Roman" w:hAnsi="Times New Roman" w:cs="Times New Roman"/>
+          <w:noProof/>
           <w:sz w:val="26"/>
           <w:szCs w:val="26"/>
         </w:rPr>
         <w:drawing>
-          <wp:inline distT="0" distB="0" distL="0" distR="0" wp14:anchorId="4317D937" wp14:editId="734B7D8B">
+          <wp:inline distT="0" distB="0" distL="0" distR="0" wp14:anchorId="115EF188" wp14:editId="0264A149">
             <wp:extent cx="5172075" cy="1684240"/>
             <wp:effectExtent l="0" t="0" r="0" b="0"/>
             <wp:docPr id="22" name="Picture 22"/>
@@ -1807,11 +1809,12 @@
       <w:r>
         <w:rPr>
           <w:rFonts w:ascii="Times New Roman" w:hAnsi="Times New Roman" w:cs="Times New Roman"/>
+          <w:noProof/>
           <w:sz w:val="26"/>
           <w:szCs w:val="26"/>
         </w:rPr>
         <w:drawing>
-          <wp:inline distT="0" distB="0" distL="0" distR="0" wp14:anchorId="1DC643E9" wp14:editId="602BE683">
+          <wp:inline distT="0" distB="0" distL="0" distR="0" wp14:anchorId="698C2DCE" wp14:editId="41C63232">
             <wp:extent cx="5381625" cy="1153370"/>
             <wp:effectExtent l="0" t="0" r="0" b="8890"/>
             <wp:docPr id="23" name="Picture 23"/>
@@ -1881,11 +1884,12 @@
       <w:r>
         <w:rPr>
           <w:rFonts w:ascii="Times New Roman" w:hAnsi="Times New Roman" w:cs="Times New Roman"/>
+          <w:noProof/>
           <w:sz w:val="26"/>
           <w:szCs w:val="26"/>
         </w:rPr>
         <w:drawing>
-          <wp:inline distT="0" distB="0" distL="0" distR="0" wp14:anchorId="0D44F5DA" wp14:editId="0115C526">
+          <wp:inline distT="0" distB="0" distL="0" distR="0" wp14:anchorId="6B808A65" wp14:editId="3D4A238D">
             <wp:extent cx="5943600" cy="2557145"/>
             <wp:effectExtent l="0" t="0" r="0" b="0"/>
             <wp:docPr id="24" name="Picture 24"/>
@@ -1972,11 +1976,12 @@
       <w:r>
         <w:rPr>
           <w:rFonts w:ascii="Times New Roman" w:hAnsi="Times New Roman" w:cs="Times New Roman"/>
+          <w:noProof/>
           <w:sz w:val="26"/>
           <w:szCs w:val="26"/>
         </w:rPr>
         <w:drawing>
-          <wp:inline distT="0" distB="0" distL="0" distR="0" wp14:anchorId="50A02035" wp14:editId="38E3AC22">
+          <wp:inline distT="0" distB="0" distL="0" distR="0" wp14:anchorId="6042B090" wp14:editId="797C6411">
             <wp:extent cx="5943600" cy="500380"/>
             <wp:effectExtent l="0" t="0" r="0" b="0"/>
             <wp:docPr id="25" name="Picture 25"/>
@@ -2046,11 +2051,12 @@
       <w:r>
         <w:rPr>
           <w:rFonts w:ascii="Times New Roman" w:hAnsi="Times New Roman" w:cs="Times New Roman"/>
+          <w:noProof/>
           <w:sz w:val="26"/>
           <w:szCs w:val="26"/>
         </w:rPr>
         <w:drawing>
-          <wp:inline distT="0" distB="0" distL="0" distR="0" wp14:anchorId="5CFAFB8D" wp14:editId="1670235F">
+          <wp:inline distT="0" distB="0" distL="0" distR="0" wp14:anchorId="3417E5A0" wp14:editId="13D0F1EF">
             <wp:extent cx="5439534" cy="562053"/>
             <wp:effectExtent l="0" t="0" r="8890" b="9525"/>
             <wp:docPr id="26" name="Picture 26"/>
@@ -2136,11 +2142,12 @@
       <w:r>
         <w:rPr>
           <w:rFonts w:ascii="Times New Roman" w:hAnsi="Times New Roman" w:cs="Times New Roman"/>
+          <w:noProof/>
           <w:sz w:val="26"/>
           <w:szCs w:val="26"/>
         </w:rPr>
         <w:drawing>
-          <wp:inline distT="0" distB="0" distL="0" distR="0" wp14:anchorId="00833490" wp14:editId="7C15F1FB">
+          <wp:inline distT="0" distB="0" distL="0" distR="0" wp14:anchorId="51DE2A40" wp14:editId="5307BD94">
             <wp:extent cx="5943600" cy="585470"/>
             <wp:effectExtent l="0" t="0" r="0" b="5080"/>
             <wp:docPr id="27" name="Picture 27"/>
@@ -2218,11 +2225,12 @@
       <w:r>
         <w:rPr>
           <w:rFonts w:ascii="Times New Roman" w:hAnsi="Times New Roman" w:cs="Times New Roman"/>
+          <w:noProof/>
           <w:sz w:val="26"/>
           <w:szCs w:val="26"/>
         </w:rPr>
         <w:drawing>
-          <wp:inline distT="0" distB="0" distL="0" distR="0" wp14:anchorId="70053967" wp14:editId="1C8BB7F2">
+          <wp:inline distT="0" distB="0" distL="0" distR="0" wp14:anchorId="6B00B8EB" wp14:editId="15C30DA1">
             <wp:extent cx="5943600" cy="513715"/>
             <wp:effectExtent l="0" t="0" r="0" b="635"/>
             <wp:docPr id="28" name="Picture 28"/>
@@ -2292,11 +2300,12 @@
       <w:r>
         <w:rPr>
           <w:rFonts w:ascii="Times New Roman" w:hAnsi="Times New Roman" w:cs="Times New Roman"/>
+          <w:noProof/>
           <w:sz w:val="26"/>
           <w:szCs w:val="26"/>
         </w:rPr>
         <w:drawing>
-          <wp:inline distT="0" distB="0" distL="0" distR="0" wp14:anchorId="0464BA9C" wp14:editId="69311C89">
+          <wp:inline distT="0" distB="0" distL="0" distR="0" wp14:anchorId="76EE8F82" wp14:editId="39046D02">
             <wp:extent cx="5943600" cy="813435"/>
             <wp:effectExtent l="0" t="0" r="0" b="5715"/>
             <wp:docPr id="29" name="Picture 29"/>
@@ -2374,11 +2383,12 @@
       <w:r>
         <w:rPr>
           <w:rFonts w:ascii="Times New Roman" w:hAnsi="Times New Roman" w:cs="Times New Roman"/>
+          <w:noProof/>
           <w:sz w:val="26"/>
           <w:szCs w:val="26"/>
         </w:rPr>
         <w:drawing>
-          <wp:inline distT="0" distB="0" distL="0" distR="0" wp14:anchorId="26698D94" wp14:editId="17F1F16D">
+          <wp:inline distT="0" distB="0" distL="0" distR="0" wp14:anchorId="79D6A616" wp14:editId="3AAE9B52">
             <wp:extent cx="3820058" cy="828791"/>
             <wp:effectExtent l="0" t="0" r="0" b="9525"/>
             <wp:docPr id="30" name="Picture 30"/>
@@ -2456,11 +2466,12 @@
       <w:r>
         <w:rPr>
           <w:rFonts w:ascii="Times New Roman" w:hAnsi="Times New Roman" w:cs="Times New Roman"/>
+          <w:noProof/>
           <w:sz w:val="26"/>
           <w:szCs w:val="26"/>
         </w:rPr>
         <w:drawing>
-          <wp:inline distT="0" distB="0" distL="0" distR="0" wp14:anchorId="748792D5" wp14:editId="0A66B42A">
+          <wp:inline distT="0" distB="0" distL="0" distR="0" wp14:anchorId="5789600B" wp14:editId="4C367C3C">
             <wp:extent cx="5782482" cy="523948"/>
             <wp:effectExtent l="0" t="0" r="8890" b="9525"/>
             <wp:docPr id="31" name="Picture 31"/>
@@ -2538,11 +2549,12 @@
       <w:r>
         <w:rPr>
           <w:rFonts w:ascii="Times New Roman" w:hAnsi="Times New Roman" w:cs="Times New Roman"/>
+          <w:noProof/>
           <w:sz w:val="26"/>
           <w:szCs w:val="26"/>
         </w:rPr>
         <w:drawing>
-          <wp:inline distT="0" distB="0" distL="0" distR="0" wp14:anchorId="350137C7" wp14:editId="4B95359A">
+          <wp:inline distT="0" distB="0" distL="0" distR="0" wp14:anchorId="6148D566" wp14:editId="422F8E75">
             <wp:extent cx="5943600" cy="483870"/>
             <wp:effectExtent l="0" t="0" r="0" b="0"/>
             <wp:docPr id="32" name="Picture 32"/>
@@ -2621,11 +2633,12 @@
       <w:r>
         <w:rPr>
           <w:rFonts w:ascii="Times New Roman" w:hAnsi="Times New Roman" w:cs="Times New Roman"/>
+          <w:noProof/>
           <w:sz w:val="26"/>
           <w:szCs w:val="26"/>
         </w:rPr>
         <w:drawing>
-          <wp:inline distT="0" distB="0" distL="0" distR="0" wp14:anchorId="1C213B6F" wp14:editId="0854AD23">
+          <wp:inline distT="0" distB="0" distL="0" distR="0" wp14:anchorId="357907A1" wp14:editId="7F267F41">
             <wp:extent cx="4381500" cy="334050"/>
             <wp:effectExtent l="0" t="0" r="0" b="8890"/>
             <wp:docPr id="35" name="Picture 35"/>
@@ -2673,11 +2686,12 @@
       <w:r>
         <w:rPr>
           <w:rFonts w:ascii="Times New Roman" w:hAnsi="Times New Roman" w:cs="Times New Roman"/>
+          <w:noProof/>
           <w:sz w:val="26"/>
           <w:szCs w:val="26"/>
         </w:rPr>
         <w:drawing>
-          <wp:inline distT="0" distB="0" distL="0" distR="0" wp14:anchorId="188320CB" wp14:editId="523D8DB8">
+          <wp:inline distT="0" distB="0" distL="0" distR="0" wp14:anchorId="02ECE3AB" wp14:editId="54E6BEC2">
             <wp:extent cx="2714625" cy="789970"/>
             <wp:effectExtent l="0" t="0" r="0" b="0"/>
             <wp:docPr id="36" name="Picture 36"/>
@@ -2725,11 +2739,12 @@
       <w:r>
         <w:rPr>
           <w:rFonts w:ascii="Times New Roman" w:hAnsi="Times New Roman" w:cs="Times New Roman"/>
+          <w:noProof/>
           <w:sz w:val="26"/>
           <w:szCs w:val="26"/>
         </w:rPr>
         <w:drawing>
-          <wp:inline distT="0" distB="0" distL="0" distR="0" wp14:anchorId="0FBED542" wp14:editId="64E39BFC">
+          <wp:inline distT="0" distB="0" distL="0" distR="0" wp14:anchorId="3330F5B1" wp14:editId="784E5047">
             <wp:extent cx="4038600" cy="2236762"/>
             <wp:effectExtent l="0" t="0" r="0" b="0"/>
             <wp:docPr id="37" name="Picture 37"/>
@@ -2807,11 +2822,12 @@
       <w:r>
         <w:rPr>
           <w:rFonts w:ascii="Times New Roman" w:hAnsi="Times New Roman" w:cs="Times New Roman"/>
+          <w:noProof/>
           <w:sz w:val="26"/>
           <w:szCs w:val="26"/>
         </w:rPr>
         <w:drawing>
-          <wp:inline distT="0" distB="0" distL="0" distR="0" wp14:anchorId="43173FAB" wp14:editId="1A486E0B">
+          <wp:inline distT="0" distB="0" distL="0" distR="0" wp14:anchorId="6F6AB0D9" wp14:editId="6B0F54D0">
             <wp:extent cx="4924425" cy="382558"/>
             <wp:effectExtent l="0" t="0" r="0" b="0"/>
             <wp:docPr id="33" name="Picture 33"/>
@@ -2889,11 +2905,12 @@
       <w:r>
         <w:rPr>
           <w:rFonts w:ascii="Times New Roman" w:hAnsi="Times New Roman" w:cs="Times New Roman"/>
+          <w:noProof/>
           <w:sz w:val="26"/>
           <w:szCs w:val="26"/>
         </w:rPr>
         <w:drawing>
-          <wp:inline distT="0" distB="0" distL="0" distR="0" wp14:anchorId="47B6B52C" wp14:editId="06CB2AD9">
+          <wp:inline distT="0" distB="0" distL="0" distR="0" wp14:anchorId="4635A3A0" wp14:editId="12D318E7">
             <wp:extent cx="5467235" cy="3009900"/>
             <wp:effectExtent l="0" t="0" r="635" b="0"/>
             <wp:docPr id="34" name="Picture 34"/>
@@ -3008,23 +3025,13 @@
           <w:szCs w:val="26"/>
         </w:rPr>
       </w:pPr>
-      <w:proofErr w:type="gramStart"/>
-      <w:r>
-        <w:rPr>
-          <w:rFonts w:ascii="Times New Roman" w:hAnsi="Times New Roman" w:cs="Times New Roman"/>
-          <w:sz w:val="26"/>
-          <w:szCs w:val="26"/>
-        </w:rPr>
-        <w:t>docker</w:t>
-      </w:r>
-      <w:proofErr w:type="gramEnd"/>
-      <w:r>
-        <w:rPr>
-          <w:rFonts w:ascii="Times New Roman" w:hAnsi="Times New Roman" w:cs="Times New Roman"/>
-          <w:sz w:val="26"/>
-          <w:szCs w:val="26"/>
-        </w:rPr>
-        <w:t xml:space="preserve"> build -t my_nginx_image .</w:t>
+      <w:r>
+        <w:rPr>
+          <w:rFonts w:ascii="Times New Roman" w:hAnsi="Times New Roman" w:cs="Times New Roman"/>
+          <w:sz w:val="26"/>
+          <w:szCs w:val="26"/>
+        </w:rPr>
+        <w:t>docker build -t my_nginx_image .</w:t>
       </w:r>
       <w:r>
         <w:rPr>
@@ -3190,44 +3197,27 @@
           <w:sz w:val="26"/>
           <w:szCs w:val="26"/>
         </w:rPr>
-        <w:t>Sử dụng node</w:t>
-      </w:r>
-      <w:proofErr w:type="gramStart"/>
-      <w:r>
-        <w:rPr>
-          <w:rFonts w:ascii="Times New Roman" w:hAnsi="Times New Roman" w:cs="Times New Roman"/>
-          <w:sz w:val="26"/>
-          <w:szCs w:val="26"/>
-        </w:rPr>
-        <w:t>:18</w:t>
-      </w:r>
-      <w:proofErr w:type="gramEnd"/>
-      <w:r>
-        <w:rPr>
-          <w:rFonts w:ascii="Times New Roman" w:hAnsi="Times New Roman" w:cs="Times New Roman"/>
-          <w:sz w:val="26"/>
-          <w:szCs w:val="26"/>
-        </w:rPr>
-        <w:t xml:space="preserve"> làm base image.</w:t>
-      </w:r>
-    </w:p>
-    <w:p>
-      <w:pPr>
-        <w:jc w:val="both"/>
-        <w:rPr>
-          <w:rFonts w:ascii="Times New Roman" w:hAnsi="Times New Roman" w:cs="Times New Roman"/>
-          <w:sz w:val="26"/>
-          <w:szCs w:val="26"/>
-        </w:rPr>
-      </w:pPr>
-      <w:r>
-        <w:rPr>
-          <w:rFonts w:ascii="Times New Roman" w:hAnsi="Times New Roman" w:cs="Times New Roman"/>
+        <w:t>Sử dụng node:18 làm base image.</w:t>
+      </w:r>
+    </w:p>
+    <w:p>
+      <w:pPr>
+        <w:jc w:val="both"/>
+        <w:rPr>
+          <w:rFonts w:ascii="Times New Roman" w:hAnsi="Times New Roman" w:cs="Times New Roman"/>
+          <w:sz w:val="26"/>
+          <w:szCs w:val="26"/>
+        </w:rPr>
+      </w:pPr>
+      <w:r>
+        <w:rPr>
+          <w:rFonts w:ascii="Times New Roman" w:hAnsi="Times New Roman" w:cs="Times New Roman"/>
+          <w:noProof/>
           <w:sz w:val="26"/>
           <w:szCs w:val="26"/>
         </w:rPr>
         <w:drawing>
-          <wp:inline distT="0" distB="0" distL="0" distR="0" wp14:anchorId="5F7A76F1" wp14:editId="2D144D60">
+          <wp:inline distT="0" distB="0" distL="0" distR="0" wp14:anchorId="476F1F59" wp14:editId="0D127379">
             <wp:extent cx="5943600" cy="3190875"/>
             <wp:effectExtent l="0" t="0" r="0" b="9525"/>
             <wp:docPr id="40" name="Picture 40"/>
@@ -3275,11 +3265,12 @@
       <w:r>
         <w:rPr>
           <w:rFonts w:ascii="Times New Roman" w:hAnsi="Times New Roman" w:cs="Times New Roman"/>
+          <w:noProof/>
           <w:sz w:val="26"/>
           <w:szCs w:val="26"/>
         </w:rPr>
         <w:drawing>
-          <wp:inline distT="0" distB="0" distL="0" distR="0" wp14:anchorId="2EEBFE13" wp14:editId="51FC27A4">
+          <wp:inline distT="0" distB="0" distL="0" distR="0" wp14:anchorId="17E4B024" wp14:editId="3B461DFC">
             <wp:extent cx="5943600" cy="951865"/>
             <wp:effectExtent l="0" t="0" r="0" b="635"/>
             <wp:docPr id="41" name="Picture 41"/>
@@ -3327,12 +3318,13 @@
       <w:r>
         <w:rPr>
           <w:rFonts w:ascii="Times New Roman" w:hAnsi="Times New Roman" w:cs="Times New Roman"/>
+          <w:noProof/>
           <w:sz w:val="26"/>
           <w:szCs w:val="26"/>
         </w:rPr>
         <w:lastRenderedPageBreak/>
         <w:drawing>
-          <wp:inline distT="0" distB="0" distL="0" distR="0" wp14:anchorId="14E31D24" wp14:editId="62A87ED6">
+          <wp:inline distT="0" distB="0" distL="0" distR="0" wp14:anchorId="0BF91C46" wp14:editId="6EBE6718">
             <wp:extent cx="5943600" cy="1524000"/>
             <wp:effectExtent l="0" t="0" r="0" b="0"/>
             <wp:docPr id="42" name="Picture 42"/>
@@ -3410,8 +3402,6 @@
         </w:rPr>
         <w:t>Yêu cầu:</w:t>
       </w:r>
-      <w:bookmarkStart w:id="0" w:name="_GoBack"/>
-      <w:bookmarkEnd w:id="0"/>
     </w:p>
     <w:p>
       <w:pPr>
@@ -3446,52 +3436,181 @@
           <w:sz w:val="26"/>
           <w:szCs w:val="26"/>
         </w:rPr>
-        <w:t>Sử dụng python</w:t>
-      </w:r>
-      <w:proofErr w:type="gramStart"/>
-      <w:r>
-        <w:rPr>
-          <w:rFonts w:ascii="Times New Roman" w:hAnsi="Times New Roman" w:cs="Times New Roman"/>
-          <w:sz w:val="26"/>
-          <w:szCs w:val="26"/>
-        </w:rPr>
-        <w:t>:3.9</w:t>
-      </w:r>
-      <w:proofErr w:type="gramEnd"/>
-      <w:r>
-        <w:rPr>
-          <w:rFonts w:ascii="Times New Roman" w:hAnsi="Times New Roman" w:cs="Times New Roman"/>
-          <w:sz w:val="26"/>
-          <w:szCs w:val="26"/>
-        </w:rPr>
-        <w:t xml:space="preserve"> làm base image.</w:t>
-      </w:r>
-    </w:p>
-    <w:p>
-      <w:pPr>
-        <w:jc w:val="both"/>
-        <w:rPr>
-          <w:rFonts w:ascii="Times New Roman" w:hAnsi="Times New Roman" w:cs="Times New Roman"/>
-          <w:sz w:val="26"/>
-          <w:szCs w:val="26"/>
-        </w:rPr>
-      </w:pPr>
-    </w:p>
-    <w:p>
-      <w:pPr>
-        <w:jc w:val="both"/>
-        <w:rPr>
-          <w:rFonts w:ascii="Times New Roman" w:hAnsi="Times New Roman" w:cs="Times New Roman"/>
-          <w:sz w:val="26"/>
-          <w:szCs w:val="26"/>
-        </w:rPr>
-      </w:pPr>
-      <w:r>
-        <w:rPr>
-          <w:rFonts w:ascii="Times New Roman" w:hAnsi="Times New Roman" w:cs="Times New Roman"/>
-          <w:sz w:val="26"/>
-          <w:szCs w:val="26"/>
-        </w:rPr>
+        <w:t>Sử dụng python:3.9 làm base image.</w:t>
+      </w:r>
+    </w:p>
+    <w:p>
+      <w:pPr>
+        <w:jc w:val="both"/>
+        <w:rPr>
+          <w:rFonts w:ascii="Times New Roman" w:hAnsi="Times New Roman" w:cs="Times New Roman"/>
+          <w:sz w:val="26"/>
+          <w:szCs w:val="26"/>
+        </w:rPr>
+      </w:pPr>
+      <w:r>
+        <w:rPr>
+          <w:rFonts w:ascii="Times New Roman" w:hAnsi="Times New Roman" w:cs="Times New Roman"/>
+          <w:sz w:val="26"/>
+          <w:szCs w:val="26"/>
+        </w:rPr>
+        <w:drawing>
+          <wp:inline distT="0" distB="0" distL="0" distR="0" wp14:anchorId="5DA9DFA7" wp14:editId="46975792">
+            <wp:extent cx="5106010" cy="3302541"/>
+            <wp:effectExtent l="0" t="0" r="0" b="0"/>
+            <wp:docPr id="38" name="Picture 38"/>
+            <wp:cNvGraphicFramePr>
+              <a:graphicFrameLocks xmlns:a="http://schemas.openxmlformats.org/drawingml/2006/main" noChangeAspect="1"/>
+            </wp:cNvGraphicFramePr>
+            <a:graphic xmlns:a="http://schemas.openxmlformats.org/drawingml/2006/main">
+              <a:graphicData uri="http://schemas.openxmlformats.org/drawingml/2006/picture">
+                <pic:pic xmlns:pic="http://schemas.openxmlformats.org/drawingml/2006/picture">
+                  <pic:nvPicPr>
+                    <pic:cNvPr id="1" name=""/>
+                    <pic:cNvPicPr/>
+                  </pic:nvPicPr>
+                  <pic:blipFill>
+                    <a:blip r:embed="rId47"/>
+                    <a:stretch>
+                      <a:fillRect/>
+                    </a:stretch>
+                  </pic:blipFill>
+                  <pic:spPr>
+                    <a:xfrm>
+                      <a:off x="0" y="0"/>
+                      <a:ext cx="5114549" cy="3308064"/>
+                    </a:xfrm>
+                    <a:prstGeom prst="rect">
+                      <a:avLst/>
+                    </a:prstGeom>
+                  </pic:spPr>
+                </pic:pic>
+              </a:graphicData>
+            </a:graphic>
+          </wp:inline>
+        </w:drawing>
+      </w:r>
+    </w:p>
+    <w:p>
+      <w:pPr>
+        <w:jc w:val="both"/>
+        <w:rPr>
+          <w:rFonts w:ascii="Times New Roman" w:hAnsi="Times New Roman" w:cs="Times New Roman"/>
+          <w:sz w:val="26"/>
+          <w:szCs w:val="26"/>
+        </w:rPr>
+      </w:pPr>
+      <w:r>
+        <w:rPr>
+          <w:rFonts w:ascii="Times New Roman" w:hAnsi="Times New Roman" w:cs="Times New Roman"/>
+          <w:sz w:val="26"/>
+          <w:szCs w:val="26"/>
+        </w:rPr>
+        <w:drawing>
+          <wp:inline distT="0" distB="0" distL="0" distR="0" wp14:anchorId="564B638B" wp14:editId="5B5C16D0">
+            <wp:extent cx="5142586" cy="719193"/>
+            <wp:effectExtent l="0" t="0" r="1270" b="5080"/>
+            <wp:docPr id="39" name="Picture 39"/>
+            <wp:cNvGraphicFramePr>
+              <a:graphicFrameLocks xmlns:a="http://schemas.openxmlformats.org/drawingml/2006/main" noChangeAspect="1"/>
+            </wp:cNvGraphicFramePr>
+            <a:graphic xmlns:a="http://schemas.openxmlformats.org/drawingml/2006/main">
+              <a:graphicData uri="http://schemas.openxmlformats.org/drawingml/2006/picture">
+                <pic:pic xmlns:pic="http://schemas.openxmlformats.org/drawingml/2006/picture">
+                  <pic:nvPicPr>
+                    <pic:cNvPr id="1" name=""/>
+                    <pic:cNvPicPr/>
+                  </pic:nvPicPr>
+                  <pic:blipFill>
+                    <a:blip r:embed="rId48"/>
+                    <a:stretch>
+                      <a:fillRect/>
+                    </a:stretch>
+                  </pic:blipFill>
+                  <pic:spPr>
+                    <a:xfrm>
+                      <a:off x="0" y="0"/>
+                      <a:ext cx="5158189" cy="721375"/>
+                    </a:xfrm>
+                    <a:prstGeom prst="rect">
+                      <a:avLst/>
+                    </a:prstGeom>
+                  </pic:spPr>
+                </pic:pic>
+              </a:graphicData>
+            </a:graphic>
+          </wp:inline>
+        </w:drawing>
+      </w:r>
+    </w:p>
+    <w:p>
+      <w:pPr>
+        <w:jc w:val="both"/>
+        <w:rPr>
+          <w:rFonts w:ascii="Times New Roman" w:hAnsi="Times New Roman" w:cs="Times New Roman"/>
+          <w:sz w:val="26"/>
+          <w:szCs w:val="26"/>
+        </w:rPr>
+      </w:pPr>
+      <w:r>
+        <w:rPr>
+          <w:rFonts w:ascii="Times New Roman" w:hAnsi="Times New Roman" w:cs="Times New Roman"/>
+          <w:sz w:val="26"/>
+          <w:szCs w:val="26"/>
+        </w:rPr>
+        <w:drawing>
+          <wp:inline distT="0" distB="0" distL="0" distR="0" wp14:anchorId="75507D24" wp14:editId="2EE4AC2A">
+            <wp:extent cx="5943600" cy="823595"/>
+            <wp:effectExtent l="0" t="0" r="0" b="0"/>
+            <wp:docPr id="43" name="Picture 43"/>
+            <wp:cNvGraphicFramePr>
+              <a:graphicFrameLocks xmlns:a="http://schemas.openxmlformats.org/drawingml/2006/main" noChangeAspect="1"/>
+            </wp:cNvGraphicFramePr>
+            <a:graphic xmlns:a="http://schemas.openxmlformats.org/drawingml/2006/main">
+              <a:graphicData uri="http://schemas.openxmlformats.org/drawingml/2006/picture">
+                <pic:pic xmlns:pic="http://schemas.openxmlformats.org/drawingml/2006/picture">
+                  <pic:nvPicPr>
+                    <pic:cNvPr id="1" name=""/>
+                    <pic:cNvPicPr/>
+                  </pic:nvPicPr>
+                  <pic:blipFill>
+                    <a:blip r:embed="rId49"/>
+                    <a:stretch>
+                      <a:fillRect/>
+                    </a:stretch>
+                  </pic:blipFill>
+                  <pic:spPr>
+                    <a:xfrm>
+                      <a:off x="0" y="0"/>
+                      <a:ext cx="5943600" cy="823595"/>
+                    </a:xfrm>
+                    <a:prstGeom prst="rect">
+                      <a:avLst/>
+                    </a:prstGeom>
+                  </pic:spPr>
+                </pic:pic>
+              </a:graphicData>
+            </a:graphic>
+          </wp:inline>
+        </w:drawing>
+      </w:r>
+    </w:p>
+    <w:p>
+      <w:pPr>
+        <w:jc w:val="both"/>
+        <w:rPr>
+          <w:rFonts w:ascii="Times New Roman" w:hAnsi="Times New Roman" w:cs="Times New Roman"/>
+          <w:sz w:val="26"/>
+          <w:szCs w:val="26"/>
+        </w:rPr>
+      </w:pPr>
+      <w:r>
+        <w:rPr>
+          <w:rFonts w:ascii="Times New Roman" w:hAnsi="Times New Roman" w:cs="Times New Roman"/>
+          <w:sz w:val="26"/>
+          <w:szCs w:val="26"/>
+        </w:rPr>
+        <w:lastRenderedPageBreak/>
         <w:t>Bài 3: Tạo Dockerfile chạy một ứng dụng React</w:t>
       </w:r>
     </w:p>
@@ -3546,52 +3665,181 @@
           <w:sz w:val="26"/>
           <w:szCs w:val="26"/>
         </w:rPr>
-        <w:t>Sử dụng node</w:t>
-      </w:r>
-      <w:proofErr w:type="gramStart"/>
-      <w:r>
-        <w:rPr>
-          <w:rFonts w:ascii="Times New Roman" w:hAnsi="Times New Roman" w:cs="Times New Roman"/>
-          <w:sz w:val="26"/>
-          <w:szCs w:val="26"/>
-        </w:rPr>
-        <w:t>:18</w:t>
-      </w:r>
-      <w:proofErr w:type="gramEnd"/>
-      <w:r>
-        <w:rPr>
-          <w:rFonts w:ascii="Times New Roman" w:hAnsi="Times New Roman" w:cs="Times New Roman"/>
-          <w:sz w:val="26"/>
-          <w:szCs w:val="26"/>
-        </w:rPr>
-        <w:t>-alpine làm base image.</w:t>
-      </w:r>
-    </w:p>
-    <w:p>
-      <w:pPr>
-        <w:jc w:val="both"/>
-        <w:rPr>
-          <w:rFonts w:ascii="Times New Roman" w:hAnsi="Times New Roman" w:cs="Times New Roman"/>
-          <w:sz w:val="26"/>
-          <w:szCs w:val="26"/>
-        </w:rPr>
-      </w:pPr>
-    </w:p>
-    <w:p>
-      <w:pPr>
-        <w:jc w:val="both"/>
-        <w:rPr>
-          <w:rFonts w:ascii="Times New Roman" w:hAnsi="Times New Roman" w:cs="Times New Roman"/>
-          <w:sz w:val="26"/>
-          <w:szCs w:val="26"/>
-        </w:rPr>
-      </w:pPr>
-      <w:r>
-        <w:rPr>
-          <w:rFonts w:ascii="Times New Roman" w:hAnsi="Times New Roman" w:cs="Times New Roman"/>
-          <w:sz w:val="26"/>
-          <w:szCs w:val="26"/>
-        </w:rPr>
+        <w:t>Sử dụng node:18-alpine làm base image.</w:t>
+      </w:r>
+    </w:p>
+    <w:p>
+      <w:pPr>
+        <w:jc w:val="both"/>
+        <w:rPr>
+          <w:rFonts w:ascii="Times New Roman" w:hAnsi="Times New Roman" w:cs="Times New Roman"/>
+          <w:sz w:val="26"/>
+          <w:szCs w:val="26"/>
+        </w:rPr>
+      </w:pPr>
+      <w:r>
+        <w:rPr>
+          <w:rFonts w:ascii="Times New Roman" w:hAnsi="Times New Roman" w:cs="Times New Roman"/>
+          <w:sz w:val="26"/>
+          <w:szCs w:val="26"/>
+        </w:rPr>
+        <w:drawing>
+          <wp:inline distT="0" distB="0" distL="0" distR="0" wp14:anchorId="24ED5195" wp14:editId="03F2EBAA">
+            <wp:extent cx="5127955" cy="3315639"/>
+            <wp:effectExtent l="0" t="0" r="0" b="0"/>
+            <wp:docPr id="45" name="Picture 45"/>
+            <wp:cNvGraphicFramePr>
+              <a:graphicFrameLocks xmlns:a="http://schemas.openxmlformats.org/drawingml/2006/main" noChangeAspect="1"/>
+            </wp:cNvGraphicFramePr>
+            <a:graphic xmlns:a="http://schemas.openxmlformats.org/drawingml/2006/main">
+              <a:graphicData uri="http://schemas.openxmlformats.org/drawingml/2006/picture">
+                <pic:pic xmlns:pic="http://schemas.openxmlformats.org/drawingml/2006/picture">
+                  <pic:nvPicPr>
+                    <pic:cNvPr id="1" name=""/>
+                    <pic:cNvPicPr/>
+                  </pic:nvPicPr>
+                  <pic:blipFill>
+                    <a:blip r:embed="rId50"/>
+                    <a:stretch>
+                      <a:fillRect/>
+                    </a:stretch>
+                  </pic:blipFill>
+                  <pic:spPr>
+                    <a:xfrm>
+                      <a:off x="0" y="0"/>
+                      <a:ext cx="5132407" cy="3318517"/>
+                    </a:xfrm>
+                    <a:prstGeom prst="rect">
+                      <a:avLst/>
+                    </a:prstGeom>
+                  </pic:spPr>
+                </pic:pic>
+              </a:graphicData>
+            </a:graphic>
+          </wp:inline>
+        </w:drawing>
+      </w:r>
+    </w:p>
+    <w:p>
+      <w:pPr>
+        <w:jc w:val="both"/>
+        <w:rPr>
+          <w:rFonts w:ascii="Times New Roman" w:hAnsi="Times New Roman" w:cs="Times New Roman"/>
+          <w:sz w:val="26"/>
+          <w:szCs w:val="26"/>
+        </w:rPr>
+      </w:pPr>
+      <w:r>
+        <w:rPr>
+          <w:rFonts w:ascii="Times New Roman" w:hAnsi="Times New Roman" w:cs="Times New Roman"/>
+          <w:sz w:val="26"/>
+          <w:szCs w:val="26"/>
+        </w:rPr>
+        <w:drawing>
+          <wp:inline distT="0" distB="0" distL="0" distR="0" wp14:anchorId="06E4F7B9" wp14:editId="31CDCF7C">
+            <wp:extent cx="4520794" cy="1383286"/>
+            <wp:effectExtent l="0" t="0" r="0" b="7620"/>
+            <wp:docPr id="46" name="Picture 46"/>
+            <wp:cNvGraphicFramePr>
+              <a:graphicFrameLocks xmlns:a="http://schemas.openxmlformats.org/drawingml/2006/main" noChangeAspect="1"/>
+            </wp:cNvGraphicFramePr>
+            <a:graphic xmlns:a="http://schemas.openxmlformats.org/drawingml/2006/main">
+              <a:graphicData uri="http://schemas.openxmlformats.org/drawingml/2006/picture">
+                <pic:pic xmlns:pic="http://schemas.openxmlformats.org/drawingml/2006/picture">
+                  <pic:nvPicPr>
+                    <pic:cNvPr id="1" name=""/>
+                    <pic:cNvPicPr/>
+                  </pic:nvPicPr>
+                  <pic:blipFill>
+                    <a:blip r:embed="rId51"/>
+                    <a:stretch>
+                      <a:fillRect/>
+                    </a:stretch>
+                  </pic:blipFill>
+                  <pic:spPr>
+                    <a:xfrm>
+                      <a:off x="0" y="0"/>
+                      <a:ext cx="4530852" cy="1386364"/>
+                    </a:xfrm>
+                    <a:prstGeom prst="rect">
+                      <a:avLst/>
+                    </a:prstGeom>
+                  </pic:spPr>
+                </pic:pic>
+              </a:graphicData>
+            </a:graphic>
+          </wp:inline>
+        </w:drawing>
+      </w:r>
+    </w:p>
+    <w:p>
+      <w:pPr>
+        <w:jc w:val="both"/>
+        <w:rPr>
+          <w:rFonts w:ascii="Times New Roman" w:hAnsi="Times New Roman" w:cs="Times New Roman"/>
+          <w:sz w:val="26"/>
+          <w:szCs w:val="26"/>
+        </w:rPr>
+      </w:pPr>
+      <w:r>
+        <w:rPr>
+          <w:rFonts w:ascii="Times New Roman" w:hAnsi="Times New Roman" w:cs="Times New Roman"/>
+          <w:sz w:val="26"/>
+          <w:szCs w:val="26"/>
+        </w:rPr>
+        <w:drawing>
+          <wp:inline distT="0" distB="0" distL="0" distR="0" wp14:anchorId="7C6F3CB5" wp14:editId="63A04887">
+            <wp:extent cx="3957523" cy="2041762"/>
+            <wp:effectExtent l="0" t="0" r="5080" b="0"/>
+            <wp:docPr id="47" name="Picture 47"/>
+            <wp:cNvGraphicFramePr>
+              <a:graphicFrameLocks xmlns:a="http://schemas.openxmlformats.org/drawingml/2006/main" noChangeAspect="1"/>
+            </wp:cNvGraphicFramePr>
+            <a:graphic xmlns:a="http://schemas.openxmlformats.org/drawingml/2006/main">
+              <a:graphicData uri="http://schemas.openxmlformats.org/drawingml/2006/picture">
+                <pic:pic xmlns:pic="http://schemas.openxmlformats.org/drawingml/2006/picture">
+                  <pic:nvPicPr>
+                    <pic:cNvPr id="1" name=""/>
+                    <pic:cNvPicPr/>
+                  </pic:nvPicPr>
+                  <pic:blipFill>
+                    <a:blip r:embed="rId52"/>
+                    <a:stretch>
+                      <a:fillRect/>
+                    </a:stretch>
+                  </pic:blipFill>
+                  <pic:spPr>
+                    <a:xfrm>
+                      <a:off x="0" y="0"/>
+                      <a:ext cx="3990724" cy="2058891"/>
+                    </a:xfrm>
+                    <a:prstGeom prst="rect">
+                      <a:avLst/>
+                    </a:prstGeom>
+                  </pic:spPr>
+                </pic:pic>
+              </a:graphicData>
+            </a:graphic>
+          </wp:inline>
+        </w:drawing>
+      </w:r>
+    </w:p>
+    <w:p>
+      <w:pPr>
+        <w:jc w:val="both"/>
+        <w:rPr>
+          <w:rFonts w:ascii="Times New Roman" w:hAnsi="Times New Roman" w:cs="Times New Roman"/>
+          <w:sz w:val="26"/>
+          <w:szCs w:val="26"/>
+        </w:rPr>
+      </w:pPr>
+      <w:r>
+        <w:rPr>
+          <w:rFonts w:ascii="Times New Roman" w:hAnsi="Times New Roman" w:cs="Times New Roman"/>
+          <w:sz w:val="26"/>
+          <w:szCs w:val="26"/>
+        </w:rPr>
+        <w:lastRenderedPageBreak/>
         <w:t>Bài 4: Tạo Dockerfile chạy một trang web tĩnh bằng Nginx</w:t>
       </w:r>
     </w:p>
@@ -3628,52 +3876,211 @@
           <w:sz w:val="26"/>
           <w:szCs w:val="26"/>
         </w:rPr>
-        <w:t>Tạo một file index.html đơn giản và sử dụng nginx</w:t>
-      </w:r>
-      <w:proofErr w:type="gramStart"/>
-      <w:r>
-        <w:rPr>
-          <w:rFonts w:ascii="Times New Roman" w:hAnsi="Times New Roman" w:cs="Times New Roman"/>
-          <w:sz w:val="26"/>
-          <w:szCs w:val="26"/>
-        </w:rPr>
-        <w:t>:latest</w:t>
-      </w:r>
-      <w:proofErr w:type="gramEnd"/>
-      <w:r>
-        <w:rPr>
-          <w:rFonts w:ascii="Times New Roman" w:hAnsi="Times New Roman" w:cs="Times New Roman"/>
-          <w:sz w:val="26"/>
-          <w:szCs w:val="26"/>
-        </w:rPr>
-        <w:t xml:space="preserve"> để phục vụ trang web.</w:t>
-      </w:r>
-    </w:p>
-    <w:p>
-      <w:pPr>
-        <w:jc w:val="both"/>
-        <w:rPr>
-          <w:rFonts w:ascii="Times New Roman" w:hAnsi="Times New Roman" w:cs="Times New Roman"/>
-          <w:sz w:val="26"/>
-          <w:szCs w:val="26"/>
-        </w:rPr>
-      </w:pPr>
-    </w:p>
-    <w:p>
-      <w:pPr>
-        <w:jc w:val="both"/>
-        <w:rPr>
-          <w:rFonts w:ascii="Times New Roman" w:hAnsi="Times New Roman" w:cs="Times New Roman"/>
-          <w:sz w:val="26"/>
-          <w:szCs w:val="26"/>
-        </w:rPr>
-      </w:pPr>
-      <w:r>
-        <w:rPr>
-          <w:rFonts w:ascii="Times New Roman" w:hAnsi="Times New Roman" w:cs="Times New Roman"/>
-          <w:sz w:val="26"/>
-          <w:szCs w:val="26"/>
-        </w:rPr>
+        <w:t>Tạo một file index.html đơn giản và sử dụng nginx:latest để phục vụ trang web.</w:t>
+      </w:r>
+    </w:p>
+    <w:p>
+      <w:pPr>
+        <w:jc w:val="both"/>
+        <w:rPr>
+          <w:rFonts w:ascii="Times New Roman" w:hAnsi="Times New Roman" w:cs="Times New Roman"/>
+          <w:sz w:val="26"/>
+          <w:szCs w:val="26"/>
+        </w:rPr>
+      </w:pPr>
+      <w:r>
+        <w:rPr>
+          <w:rFonts w:ascii="Times New Roman" w:hAnsi="Times New Roman" w:cs="Times New Roman"/>
+          <w:sz w:val="26"/>
+          <w:szCs w:val="26"/>
+        </w:rPr>
+        <w:drawing>
+          <wp:inline distT="0" distB="0" distL="0" distR="0" wp14:anchorId="204EB1E6" wp14:editId="47346CFC">
+            <wp:extent cx="4835347" cy="3172938"/>
+            <wp:effectExtent l="0" t="0" r="3810" b="8890"/>
+            <wp:docPr id="48" name="Picture 48"/>
+            <wp:cNvGraphicFramePr>
+              <a:graphicFrameLocks xmlns:a="http://schemas.openxmlformats.org/drawingml/2006/main" noChangeAspect="1"/>
+            </wp:cNvGraphicFramePr>
+            <a:graphic xmlns:a="http://schemas.openxmlformats.org/drawingml/2006/main">
+              <a:graphicData uri="http://schemas.openxmlformats.org/drawingml/2006/picture">
+                <pic:pic xmlns:pic="http://schemas.openxmlformats.org/drawingml/2006/picture">
+                  <pic:nvPicPr>
+                    <pic:cNvPr id="1" name=""/>
+                    <pic:cNvPicPr/>
+                  </pic:nvPicPr>
+                  <pic:blipFill>
+                    <a:blip r:embed="rId53"/>
+                    <a:stretch>
+                      <a:fillRect/>
+                    </a:stretch>
+                  </pic:blipFill>
+                  <pic:spPr>
+                    <a:xfrm>
+                      <a:off x="0" y="0"/>
+                      <a:ext cx="4840915" cy="3176592"/>
+                    </a:xfrm>
+                    <a:prstGeom prst="rect">
+                      <a:avLst/>
+                    </a:prstGeom>
+                  </pic:spPr>
+                </pic:pic>
+              </a:graphicData>
+            </a:graphic>
+          </wp:inline>
+        </w:drawing>
+      </w:r>
+    </w:p>
+    <w:p>
+      <w:pPr>
+        <w:jc w:val="both"/>
+        <w:rPr>
+          <w:rFonts w:ascii="Times New Roman" w:hAnsi="Times New Roman" w:cs="Times New Roman"/>
+          <w:sz w:val="26"/>
+          <w:szCs w:val="26"/>
+        </w:rPr>
+      </w:pPr>
+      <w:r>
+        <w:rPr>
+          <w:rFonts w:ascii="Times New Roman" w:hAnsi="Times New Roman" w:cs="Times New Roman"/>
+          <w:sz w:val="26"/>
+          <w:szCs w:val="26"/>
+        </w:rPr>
+        <w:drawing>
+          <wp:inline distT="0" distB="0" distL="0" distR="0" wp14:anchorId="5785028C" wp14:editId="42153D85">
+            <wp:extent cx="5943600" cy="464820"/>
+            <wp:effectExtent l="0" t="0" r="0" b="0"/>
+            <wp:docPr id="49" name="Picture 49"/>
+            <wp:cNvGraphicFramePr>
+              <a:graphicFrameLocks xmlns:a="http://schemas.openxmlformats.org/drawingml/2006/main" noChangeAspect="1"/>
+            </wp:cNvGraphicFramePr>
+            <a:graphic xmlns:a="http://schemas.openxmlformats.org/drawingml/2006/main">
+              <a:graphicData uri="http://schemas.openxmlformats.org/drawingml/2006/picture">
+                <pic:pic xmlns:pic="http://schemas.openxmlformats.org/drawingml/2006/picture">
+                  <pic:nvPicPr>
+                    <pic:cNvPr id="1" name=""/>
+                    <pic:cNvPicPr/>
+                  </pic:nvPicPr>
+                  <pic:blipFill>
+                    <a:blip r:embed="rId54"/>
+                    <a:stretch>
+                      <a:fillRect/>
+                    </a:stretch>
+                  </pic:blipFill>
+                  <pic:spPr>
+                    <a:xfrm>
+                      <a:off x="0" y="0"/>
+                      <a:ext cx="5943600" cy="464820"/>
+                    </a:xfrm>
+                    <a:prstGeom prst="rect">
+                      <a:avLst/>
+                    </a:prstGeom>
+                  </pic:spPr>
+                </pic:pic>
+              </a:graphicData>
+            </a:graphic>
+          </wp:inline>
+        </w:drawing>
+      </w:r>
+    </w:p>
+    <w:p>
+      <w:pPr>
+        <w:jc w:val="both"/>
+        <w:rPr>
+          <w:rFonts w:ascii="Times New Roman" w:hAnsi="Times New Roman" w:cs="Times New Roman"/>
+          <w:sz w:val="26"/>
+          <w:szCs w:val="26"/>
+        </w:rPr>
+      </w:pPr>
+      <w:r>
+        <w:rPr>
+          <w:rFonts w:ascii="Times New Roman" w:hAnsi="Times New Roman" w:cs="Times New Roman"/>
+          <w:sz w:val="26"/>
+          <w:szCs w:val="26"/>
+        </w:rPr>
+        <w:drawing>
+          <wp:inline distT="0" distB="0" distL="0" distR="0" wp14:anchorId="14E10DE1" wp14:editId="69A781D5">
+            <wp:extent cx="5943600" cy="2400300"/>
+            <wp:effectExtent l="0" t="0" r="0" b="0"/>
+            <wp:docPr id="50" name="Picture 50"/>
+            <wp:cNvGraphicFramePr>
+              <a:graphicFrameLocks xmlns:a="http://schemas.openxmlformats.org/drawingml/2006/main" noChangeAspect="1"/>
+            </wp:cNvGraphicFramePr>
+            <a:graphic xmlns:a="http://schemas.openxmlformats.org/drawingml/2006/main">
+              <a:graphicData uri="http://schemas.openxmlformats.org/drawingml/2006/picture">
+                <pic:pic xmlns:pic="http://schemas.openxmlformats.org/drawingml/2006/picture">
+                  <pic:nvPicPr>
+                    <pic:cNvPr id="1" name=""/>
+                    <pic:cNvPicPr/>
+                  </pic:nvPicPr>
+                  <pic:blipFill>
+                    <a:blip r:embed="rId55"/>
+                    <a:stretch>
+                      <a:fillRect/>
+                    </a:stretch>
+                  </pic:blipFill>
+                  <pic:spPr>
+                    <a:xfrm>
+                      <a:off x="0" y="0"/>
+                      <a:ext cx="5943600" cy="2400300"/>
+                    </a:xfrm>
+                    <a:prstGeom prst="rect">
+                      <a:avLst/>
+                    </a:prstGeom>
+                  </pic:spPr>
+                </pic:pic>
+              </a:graphicData>
+            </a:graphic>
+          </wp:inline>
+        </w:drawing>
+      </w:r>
+    </w:p>
+    <w:p>
+      <w:pPr>
+        <w:jc w:val="both"/>
+        <w:rPr>
+          <w:rFonts w:ascii="Times New Roman" w:hAnsi="Times New Roman" w:cs="Times New Roman"/>
+          <w:sz w:val="26"/>
+          <w:szCs w:val="26"/>
+        </w:rPr>
+      </w:pPr>
+    </w:p>
+    <w:p>
+      <w:pPr>
+        <w:jc w:val="both"/>
+        <w:rPr>
+          <w:rFonts w:ascii="Times New Roman" w:hAnsi="Times New Roman" w:cs="Times New Roman"/>
+          <w:sz w:val="26"/>
+          <w:szCs w:val="26"/>
+        </w:rPr>
+      </w:pPr>
+    </w:p>
+    <w:p>
+      <w:pPr>
+        <w:jc w:val="both"/>
+        <w:rPr>
+          <w:rFonts w:ascii="Times New Roman" w:hAnsi="Times New Roman" w:cs="Times New Roman"/>
+          <w:sz w:val="26"/>
+          <w:szCs w:val="26"/>
+        </w:rPr>
+      </w:pPr>
+    </w:p>
+    <w:p>
+      <w:pPr>
+        <w:jc w:val="both"/>
+        <w:rPr>
+          <w:rFonts w:ascii="Times New Roman" w:hAnsi="Times New Roman" w:cs="Times New Roman"/>
+          <w:sz w:val="26"/>
+          <w:szCs w:val="26"/>
+        </w:rPr>
+      </w:pPr>
+      <w:r>
+        <w:rPr>
+          <w:rFonts w:ascii="Times New Roman" w:hAnsi="Times New Roman" w:cs="Times New Roman"/>
+          <w:sz w:val="26"/>
+          <w:szCs w:val="26"/>
+        </w:rPr>
+        <w:lastRenderedPageBreak/>
         <w:t>Bài 5: Tạo Dockerfile cho ứng dụng Go</w:t>
       </w:r>
     </w:p>
@@ -3722,6 +4129,152 @@
           <w:szCs w:val="26"/>
         </w:rPr>
       </w:pPr>
+      <w:r>
+        <w:rPr>
+          <w:rFonts w:ascii="Times New Roman" w:hAnsi="Times New Roman" w:cs="Times New Roman"/>
+          <w:sz w:val="26"/>
+          <w:szCs w:val="26"/>
+        </w:rPr>
+        <w:drawing>
+          <wp:inline distT="0" distB="0" distL="0" distR="0" wp14:anchorId="4F9552E2" wp14:editId="3D82DAC0">
+            <wp:extent cx="4572000" cy="2929792"/>
+            <wp:effectExtent l="0" t="0" r="0" b="4445"/>
+            <wp:docPr id="51" name="Picture 51"/>
+            <wp:cNvGraphicFramePr>
+              <a:graphicFrameLocks xmlns:a="http://schemas.openxmlformats.org/drawingml/2006/main" noChangeAspect="1"/>
+            </wp:cNvGraphicFramePr>
+            <a:graphic xmlns:a="http://schemas.openxmlformats.org/drawingml/2006/main">
+              <a:graphicData uri="http://schemas.openxmlformats.org/drawingml/2006/picture">
+                <pic:pic xmlns:pic="http://schemas.openxmlformats.org/drawingml/2006/picture">
+                  <pic:nvPicPr>
+                    <pic:cNvPr id="1" name=""/>
+                    <pic:cNvPicPr/>
+                  </pic:nvPicPr>
+                  <pic:blipFill>
+                    <a:blip r:embed="rId56"/>
+                    <a:stretch>
+                      <a:fillRect/>
+                    </a:stretch>
+                  </pic:blipFill>
+                  <pic:spPr>
+                    <a:xfrm>
+                      <a:off x="0" y="0"/>
+                      <a:ext cx="4576943" cy="2932960"/>
+                    </a:xfrm>
+                    <a:prstGeom prst="rect">
+                      <a:avLst/>
+                    </a:prstGeom>
+                  </pic:spPr>
+                </pic:pic>
+              </a:graphicData>
+            </a:graphic>
+          </wp:inline>
+        </w:drawing>
+      </w:r>
+    </w:p>
+    <w:p>
+      <w:pPr>
+        <w:jc w:val="both"/>
+        <w:rPr>
+          <w:rFonts w:ascii="Times New Roman" w:hAnsi="Times New Roman" w:cs="Times New Roman"/>
+          <w:sz w:val="26"/>
+          <w:szCs w:val="26"/>
+        </w:rPr>
+      </w:pPr>
+      <w:r>
+        <w:rPr>
+          <w:rFonts w:ascii="Times New Roman" w:hAnsi="Times New Roman" w:cs="Times New Roman"/>
+          <w:sz w:val="26"/>
+          <w:szCs w:val="26"/>
+        </w:rPr>
+        <w:drawing>
+          <wp:inline distT="0" distB="0" distL="0" distR="0" wp14:anchorId="2974C27C" wp14:editId="534B5574">
+            <wp:extent cx="5943600" cy="400050"/>
+            <wp:effectExtent l="0" t="0" r="0" b="0"/>
+            <wp:docPr id="52" name="Picture 52"/>
+            <wp:cNvGraphicFramePr>
+              <a:graphicFrameLocks xmlns:a="http://schemas.openxmlformats.org/drawingml/2006/main" noChangeAspect="1"/>
+            </wp:cNvGraphicFramePr>
+            <a:graphic xmlns:a="http://schemas.openxmlformats.org/drawingml/2006/main">
+              <a:graphicData uri="http://schemas.openxmlformats.org/drawingml/2006/picture">
+                <pic:pic xmlns:pic="http://schemas.openxmlformats.org/drawingml/2006/picture">
+                  <pic:nvPicPr>
+                    <pic:cNvPr id="1" name=""/>
+                    <pic:cNvPicPr/>
+                  </pic:nvPicPr>
+                  <pic:blipFill>
+                    <a:blip r:embed="rId57"/>
+                    <a:stretch>
+                      <a:fillRect/>
+                    </a:stretch>
+                  </pic:blipFill>
+                  <pic:spPr>
+                    <a:xfrm>
+                      <a:off x="0" y="0"/>
+                      <a:ext cx="5943600" cy="400050"/>
+                    </a:xfrm>
+                    <a:prstGeom prst="rect">
+                      <a:avLst/>
+                    </a:prstGeom>
+                  </pic:spPr>
+                </pic:pic>
+              </a:graphicData>
+            </a:graphic>
+          </wp:inline>
+        </w:drawing>
+      </w:r>
+    </w:p>
+    <w:p>
+      <w:pPr>
+        <w:jc w:val="both"/>
+        <w:rPr>
+          <w:rFonts w:ascii="Times New Roman" w:hAnsi="Times New Roman" w:cs="Times New Roman"/>
+          <w:sz w:val="26"/>
+          <w:szCs w:val="26"/>
+        </w:rPr>
+      </w:pPr>
+      <w:r>
+        <w:rPr>
+          <w:rFonts w:ascii="Times New Roman" w:hAnsi="Times New Roman" w:cs="Times New Roman"/>
+          <w:sz w:val="26"/>
+          <w:szCs w:val="26"/>
+        </w:rPr>
+        <w:drawing>
+          <wp:inline distT="0" distB="0" distL="0" distR="0" wp14:anchorId="4008FAAB" wp14:editId="46DCEA54">
+            <wp:extent cx="5943600" cy="723265"/>
+            <wp:effectExtent l="0" t="0" r="0" b="635"/>
+            <wp:docPr id="53" name="Picture 53"/>
+            <wp:cNvGraphicFramePr>
+              <a:graphicFrameLocks xmlns:a="http://schemas.openxmlformats.org/drawingml/2006/main" noChangeAspect="1"/>
+            </wp:cNvGraphicFramePr>
+            <a:graphic xmlns:a="http://schemas.openxmlformats.org/drawingml/2006/main">
+              <a:graphicData uri="http://schemas.openxmlformats.org/drawingml/2006/picture">
+                <pic:pic xmlns:pic="http://schemas.openxmlformats.org/drawingml/2006/picture">
+                  <pic:nvPicPr>
+                    <pic:cNvPr id="1" name=""/>
+                    <pic:cNvPicPr/>
+                  </pic:nvPicPr>
+                  <pic:blipFill>
+                    <a:blip r:embed="rId58"/>
+                    <a:stretch>
+                      <a:fillRect/>
+                    </a:stretch>
+                  </pic:blipFill>
+                  <pic:spPr>
+                    <a:xfrm>
+                      <a:off x="0" y="0"/>
+                      <a:ext cx="5943600" cy="723265"/>
+                    </a:xfrm>
+                    <a:prstGeom prst="rect">
+                      <a:avLst/>
+                    </a:prstGeom>
+                  </pic:spPr>
+                </pic:pic>
+              </a:graphicData>
+            </a:graphic>
+          </wp:inline>
+        </w:drawing>
+      </w:r>
     </w:p>
     <w:p>
       <w:pPr>
@@ -3774,25 +4327,25 @@
           <w:sz w:val="26"/>
           <w:szCs w:val="26"/>
         </w:rPr>
-        <w:t>Stage 1: Dùng node</w:t>
-      </w:r>
-      <w:proofErr w:type="gramStart"/>
-      <w:r>
-        <w:rPr>
-          <w:rFonts w:ascii="Times New Roman" w:hAnsi="Times New Roman" w:cs="Times New Roman"/>
-          <w:sz w:val="26"/>
-          <w:szCs w:val="26"/>
-        </w:rPr>
-        <w:t>:18</w:t>
-      </w:r>
-      <w:proofErr w:type="gramEnd"/>
-      <w:r>
-        <w:rPr>
-          <w:rFonts w:ascii="Times New Roman" w:hAnsi="Times New Roman" w:cs="Times New Roman"/>
-          <w:sz w:val="26"/>
-          <w:szCs w:val="26"/>
-        </w:rPr>
-        <w:t xml:space="preserve"> để build code.</w:t>
+        <w:t>Stage 1: Dùng node:18 để build code.</w:t>
+      </w:r>
+    </w:p>
+    <w:p>
+      <w:pPr>
+        <w:jc w:val="both"/>
+        <w:rPr>
+          <w:rFonts w:ascii="Times New Roman" w:hAnsi="Times New Roman" w:cs="Times New Roman"/>
+          <w:sz w:val="26"/>
+          <w:szCs w:val="26"/>
+        </w:rPr>
+      </w:pPr>
+      <w:r>
+        <w:rPr>
+          <w:rFonts w:ascii="Times New Roman" w:hAnsi="Times New Roman" w:cs="Times New Roman"/>
+          <w:sz w:val="26"/>
+          <w:szCs w:val="26"/>
+        </w:rPr>
+        <w:t>Stage 2: Dùng node:18-alpine để chạy ứng dụng đã build.</w:t>
       </w:r>
     </w:p>
     <w:p>
@@ -3811,36 +4364,146 @@
           <w:szCs w:val="26"/>
         </w:rPr>
         <w:lastRenderedPageBreak/>
-        <w:t>Stage 2: Dùng node</w:t>
-      </w:r>
-      <w:proofErr w:type="gramStart"/>
-      <w:r>
-        <w:rPr>
-          <w:rFonts w:ascii="Times New Roman" w:hAnsi="Times New Roman" w:cs="Times New Roman"/>
-          <w:sz w:val="26"/>
-          <w:szCs w:val="26"/>
-        </w:rPr>
-        <w:t>:18</w:t>
-      </w:r>
-      <w:proofErr w:type="gramEnd"/>
-      <w:r>
-        <w:rPr>
-          <w:rFonts w:ascii="Times New Roman" w:hAnsi="Times New Roman" w:cs="Times New Roman"/>
-          <w:sz w:val="26"/>
-          <w:szCs w:val="26"/>
-        </w:rPr>
-        <w:t>-alpine để chạy ứng dụng đã build.</w:t>
-      </w:r>
-    </w:p>
-    <w:p>
-      <w:pPr>
-        <w:jc w:val="both"/>
-        <w:rPr>
-          <w:rFonts w:ascii="Times New Roman" w:hAnsi="Times New Roman" w:cs="Times New Roman"/>
-          <w:sz w:val="26"/>
-          <w:szCs w:val="26"/>
-        </w:rPr>
-      </w:pPr>
+        <w:drawing>
+          <wp:inline distT="0" distB="0" distL="0" distR="0" wp14:anchorId="1B58D8C9" wp14:editId="09D3CE80">
+            <wp:extent cx="4988966" cy="3141556"/>
+            <wp:effectExtent l="0" t="0" r="2540" b="1905"/>
+            <wp:docPr id="54" name="Picture 54"/>
+            <wp:cNvGraphicFramePr>
+              <a:graphicFrameLocks xmlns:a="http://schemas.openxmlformats.org/drawingml/2006/main" noChangeAspect="1"/>
+            </wp:cNvGraphicFramePr>
+            <a:graphic xmlns:a="http://schemas.openxmlformats.org/drawingml/2006/main">
+              <a:graphicData uri="http://schemas.openxmlformats.org/drawingml/2006/picture">
+                <pic:pic xmlns:pic="http://schemas.openxmlformats.org/drawingml/2006/picture">
+                  <pic:nvPicPr>
+                    <pic:cNvPr id="1" name=""/>
+                    <pic:cNvPicPr/>
+                  </pic:nvPicPr>
+                  <pic:blipFill>
+                    <a:blip r:embed="rId59"/>
+                    <a:stretch>
+                      <a:fillRect/>
+                    </a:stretch>
+                  </pic:blipFill>
+                  <pic:spPr>
+                    <a:xfrm>
+                      <a:off x="0" y="0"/>
+                      <a:ext cx="4993346" cy="3144314"/>
+                    </a:xfrm>
+                    <a:prstGeom prst="rect">
+                      <a:avLst/>
+                    </a:prstGeom>
+                  </pic:spPr>
+                </pic:pic>
+              </a:graphicData>
+            </a:graphic>
+          </wp:inline>
+        </w:drawing>
+      </w:r>
+    </w:p>
+    <w:p>
+      <w:pPr>
+        <w:jc w:val="both"/>
+        <w:rPr>
+          <w:rFonts w:ascii="Times New Roman" w:hAnsi="Times New Roman" w:cs="Times New Roman"/>
+          <w:sz w:val="26"/>
+          <w:szCs w:val="26"/>
+        </w:rPr>
+      </w:pPr>
+      <w:r>
+        <w:rPr>
+          <w:rFonts w:ascii="Times New Roman" w:hAnsi="Times New Roman" w:cs="Times New Roman"/>
+          <w:sz w:val="26"/>
+          <w:szCs w:val="26"/>
+        </w:rPr>
+        <w:drawing>
+          <wp:inline distT="0" distB="0" distL="0" distR="0" wp14:anchorId="6BB0E001" wp14:editId="48FF77DA">
+            <wp:extent cx="5943600" cy="454660"/>
+            <wp:effectExtent l="0" t="0" r="0" b="2540"/>
+            <wp:docPr id="55" name="Picture 55"/>
+            <wp:cNvGraphicFramePr>
+              <a:graphicFrameLocks xmlns:a="http://schemas.openxmlformats.org/drawingml/2006/main" noChangeAspect="1"/>
+            </wp:cNvGraphicFramePr>
+            <a:graphic xmlns:a="http://schemas.openxmlformats.org/drawingml/2006/main">
+              <a:graphicData uri="http://schemas.openxmlformats.org/drawingml/2006/picture">
+                <pic:pic xmlns:pic="http://schemas.openxmlformats.org/drawingml/2006/picture">
+                  <pic:nvPicPr>
+                    <pic:cNvPr id="1" name=""/>
+                    <pic:cNvPicPr/>
+                  </pic:nvPicPr>
+                  <pic:blipFill>
+                    <a:blip r:embed="rId60"/>
+                    <a:stretch>
+                      <a:fillRect/>
+                    </a:stretch>
+                  </pic:blipFill>
+                  <pic:spPr>
+                    <a:xfrm>
+                      <a:off x="0" y="0"/>
+                      <a:ext cx="5943600" cy="454660"/>
+                    </a:xfrm>
+                    <a:prstGeom prst="rect">
+                      <a:avLst/>
+                    </a:prstGeom>
+                  </pic:spPr>
+                </pic:pic>
+              </a:graphicData>
+            </a:graphic>
+          </wp:inline>
+        </w:drawing>
+      </w:r>
+    </w:p>
+    <w:p>
+      <w:pPr>
+        <w:jc w:val="both"/>
+        <w:rPr>
+          <w:rFonts w:ascii="Times New Roman" w:hAnsi="Times New Roman" w:cs="Times New Roman"/>
+          <w:sz w:val="26"/>
+          <w:szCs w:val="26"/>
+        </w:rPr>
+      </w:pPr>
+      <w:r>
+        <w:rPr>
+          <w:rFonts w:ascii="Times New Roman" w:hAnsi="Times New Roman" w:cs="Times New Roman"/>
+          <w:sz w:val="26"/>
+          <w:szCs w:val="26"/>
+        </w:rPr>
+        <w:drawing>
+          <wp:inline distT="0" distB="0" distL="0" distR="0" wp14:anchorId="640A4C22" wp14:editId="71D36F63">
+            <wp:extent cx="5943600" cy="1035685"/>
+            <wp:effectExtent l="0" t="0" r="0" b="0"/>
+            <wp:docPr id="56" name="Picture 56"/>
+            <wp:cNvGraphicFramePr>
+              <a:graphicFrameLocks xmlns:a="http://schemas.openxmlformats.org/drawingml/2006/main" noChangeAspect="1"/>
+            </wp:cNvGraphicFramePr>
+            <a:graphic xmlns:a="http://schemas.openxmlformats.org/drawingml/2006/main">
+              <a:graphicData uri="http://schemas.openxmlformats.org/drawingml/2006/picture">
+                <pic:pic xmlns:pic="http://schemas.openxmlformats.org/drawingml/2006/picture">
+                  <pic:nvPicPr>
+                    <pic:cNvPr id="1" name=""/>
+                    <pic:cNvPicPr/>
+                  </pic:nvPicPr>
+                  <pic:blipFill>
+                    <a:blip r:embed="rId61"/>
+                    <a:stretch>
+                      <a:fillRect/>
+                    </a:stretch>
+                  </pic:blipFill>
+                  <pic:spPr>
+                    <a:xfrm>
+                      <a:off x="0" y="0"/>
+                      <a:ext cx="5943600" cy="1035685"/>
+                    </a:xfrm>
+                    <a:prstGeom prst="rect">
+                      <a:avLst/>
+                    </a:prstGeom>
+                  </pic:spPr>
+                </pic:pic>
+              </a:graphicData>
+            </a:graphic>
+          </wp:inline>
+        </w:drawing>
+      </w:r>
     </w:p>
     <w:p>
       <w:pPr>
@@ -3923,6 +4586,153 @@
           <w:szCs w:val="26"/>
         </w:rPr>
       </w:pPr>
+      <w:r>
+        <w:rPr>
+          <w:rFonts w:ascii="Times New Roman" w:hAnsi="Times New Roman" w:cs="Times New Roman"/>
+          <w:sz w:val="26"/>
+          <w:szCs w:val="26"/>
+        </w:rPr>
+        <w:lastRenderedPageBreak/>
+        <w:drawing>
+          <wp:inline distT="0" distB="0" distL="0" distR="0" wp14:anchorId="0D61E72F" wp14:editId="7272B869">
+            <wp:extent cx="4550054" cy="2728574"/>
+            <wp:effectExtent l="0" t="0" r="3175" b="0"/>
+            <wp:docPr id="57" name="Picture 57"/>
+            <wp:cNvGraphicFramePr>
+              <a:graphicFrameLocks xmlns:a="http://schemas.openxmlformats.org/drawingml/2006/main" noChangeAspect="1"/>
+            </wp:cNvGraphicFramePr>
+            <a:graphic xmlns:a="http://schemas.openxmlformats.org/drawingml/2006/main">
+              <a:graphicData uri="http://schemas.openxmlformats.org/drawingml/2006/picture">
+                <pic:pic xmlns:pic="http://schemas.openxmlformats.org/drawingml/2006/picture">
+                  <pic:nvPicPr>
+                    <pic:cNvPr id="1" name=""/>
+                    <pic:cNvPicPr/>
+                  </pic:nvPicPr>
+                  <pic:blipFill>
+                    <a:blip r:embed="rId62"/>
+                    <a:stretch>
+                      <a:fillRect/>
+                    </a:stretch>
+                  </pic:blipFill>
+                  <pic:spPr>
+                    <a:xfrm>
+                      <a:off x="0" y="0"/>
+                      <a:ext cx="4551884" cy="2729671"/>
+                    </a:xfrm>
+                    <a:prstGeom prst="rect">
+                      <a:avLst/>
+                    </a:prstGeom>
+                  </pic:spPr>
+                </pic:pic>
+              </a:graphicData>
+            </a:graphic>
+          </wp:inline>
+        </w:drawing>
+      </w:r>
+    </w:p>
+    <w:p>
+      <w:pPr>
+        <w:jc w:val="both"/>
+        <w:rPr>
+          <w:rFonts w:ascii="Times New Roman" w:hAnsi="Times New Roman" w:cs="Times New Roman"/>
+          <w:sz w:val="26"/>
+          <w:szCs w:val="26"/>
+        </w:rPr>
+      </w:pPr>
+      <w:r>
+        <w:rPr>
+          <w:rFonts w:ascii="Times New Roman" w:hAnsi="Times New Roman" w:cs="Times New Roman"/>
+          <w:sz w:val="26"/>
+          <w:szCs w:val="26"/>
+        </w:rPr>
+        <w:drawing>
+          <wp:inline distT="0" distB="0" distL="0" distR="0" wp14:anchorId="51223BC7" wp14:editId="0D2672E1">
+            <wp:extent cx="5943600" cy="899160"/>
+            <wp:effectExtent l="0" t="0" r="0" b="0"/>
+            <wp:docPr id="58" name="Picture 58"/>
+            <wp:cNvGraphicFramePr>
+              <a:graphicFrameLocks xmlns:a="http://schemas.openxmlformats.org/drawingml/2006/main" noChangeAspect="1"/>
+            </wp:cNvGraphicFramePr>
+            <a:graphic xmlns:a="http://schemas.openxmlformats.org/drawingml/2006/main">
+              <a:graphicData uri="http://schemas.openxmlformats.org/drawingml/2006/picture">
+                <pic:pic xmlns:pic="http://schemas.openxmlformats.org/drawingml/2006/picture">
+                  <pic:nvPicPr>
+                    <pic:cNvPr id="1" name=""/>
+                    <pic:cNvPicPr/>
+                  </pic:nvPicPr>
+                  <pic:blipFill>
+                    <a:blip r:embed="rId63"/>
+                    <a:stretch>
+                      <a:fillRect/>
+                    </a:stretch>
+                  </pic:blipFill>
+                  <pic:spPr>
+                    <a:xfrm>
+                      <a:off x="0" y="0"/>
+                      <a:ext cx="5943600" cy="899160"/>
+                    </a:xfrm>
+                    <a:prstGeom prst="rect">
+                      <a:avLst/>
+                    </a:prstGeom>
+                  </pic:spPr>
+                </pic:pic>
+              </a:graphicData>
+            </a:graphic>
+          </wp:inline>
+        </w:drawing>
+      </w:r>
+    </w:p>
+    <w:p>
+      <w:pPr>
+        <w:jc w:val="both"/>
+        <w:rPr>
+          <w:rFonts w:ascii="Times New Roman" w:hAnsi="Times New Roman" w:cs="Times New Roman"/>
+          <w:sz w:val="26"/>
+          <w:szCs w:val="26"/>
+        </w:rPr>
+      </w:pPr>
+      <w:r>
+        <w:rPr>
+          <w:rFonts w:ascii="Times New Roman" w:hAnsi="Times New Roman" w:cs="Times New Roman"/>
+          <w:sz w:val="26"/>
+          <w:szCs w:val="26"/>
+        </w:rPr>
+        <w:drawing>
+          <wp:inline distT="0" distB="0" distL="0" distR="0" wp14:anchorId="1B7B54EF" wp14:editId="0F0D35BC">
+            <wp:extent cx="5943600" cy="814705"/>
+            <wp:effectExtent l="0" t="0" r="0" b="4445"/>
+            <wp:docPr id="59" name="Picture 59"/>
+            <wp:cNvGraphicFramePr>
+              <a:graphicFrameLocks xmlns:a="http://schemas.openxmlformats.org/drawingml/2006/main" noChangeAspect="1"/>
+            </wp:cNvGraphicFramePr>
+            <a:graphic xmlns:a="http://schemas.openxmlformats.org/drawingml/2006/main">
+              <a:graphicData uri="http://schemas.openxmlformats.org/drawingml/2006/picture">
+                <pic:pic xmlns:pic="http://schemas.openxmlformats.org/drawingml/2006/picture">
+                  <pic:nvPicPr>
+                    <pic:cNvPr id="1" name=""/>
+                    <pic:cNvPicPr/>
+                  </pic:nvPicPr>
+                  <pic:blipFill>
+                    <a:blip r:embed="rId64"/>
+                    <a:stretch>
+                      <a:fillRect/>
+                    </a:stretch>
+                  </pic:blipFill>
+                  <pic:spPr>
+                    <a:xfrm>
+                      <a:off x="0" y="0"/>
+                      <a:ext cx="5943600" cy="814705"/>
+                    </a:xfrm>
+                    <a:prstGeom prst="rect">
+                      <a:avLst/>
+                    </a:prstGeom>
+                  </pic:spPr>
+                </pic:pic>
+              </a:graphicData>
+            </a:graphic>
+          </wp:inline>
+        </w:drawing>
+      </w:r>
     </w:p>
     <w:p>
       <w:pPr>
@@ -3975,80 +4785,337 @@
           <w:sz w:val="26"/>
           <w:szCs w:val="26"/>
         </w:rPr>
-        <w:t>Viết Dockerfile để chạy PostgreSQL (postgres</w:t>
-      </w:r>
-      <w:proofErr w:type="gramStart"/>
-      <w:r>
-        <w:rPr>
-          <w:rFonts w:ascii="Times New Roman" w:hAnsi="Times New Roman" w:cs="Times New Roman"/>
-          <w:sz w:val="26"/>
-          <w:szCs w:val="26"/>
-        </w:rPr>
-        <w:t>:15</w:t>
-      </w:r>
-      <w:proofErr w:type="gramEnd"/>
-      <w:r>
-        <w:rPr>
-          <w:rFonts w:ascii="Times New Roman" w:hAnsi="Times New Roman" w:cs="Times New Roman"/>
-          <w:sz w:val="26"/>
-          <w:szCs w:val="26"/>
-        </w:rPr>
-        <w:t>).</w:t>
-      </w:r>
-    </w:p>
-    <w:p>
-      <w:pPr>
-        <w:jc w:val="both"/>
-        <w:rPr>
-          <w:rFonts w:ascii="Times New Roman" w:hAnsi="Times New Roman" w:cs="Times New Roman"/>
-          <w:sz w:val="26"/>
-          <w:szCs w:val="26"/>
-        </w:rPr>
-      </w:pPr>
-      <w:proofErr w:type="gramStart"/>
-      <w:r>
-        <w:rPr>
-          <w:rFonts w:ascii="Times New Roman" w:hAnsi="Times New Roman" w:cs="Times New Roman"/>
-          <w:sz w:val="26"/>
-          <w:szCs w:val="26"/>
-        </w:rPr>
-        <w:t>Thêm</w:t>
-      </w:r>
-      <w:proofErr w:type="gramEnd"/>
-      <w:r>
-        <w:rPr>
-          <w:rFonts w:ascii="Times New Roman" w:hAnsi="Times New Roman" w:cs="Times New Roman"/>
-          <w:sz w:val="26"/>
-          <w:szCs w:val="26"/>
-        </w:rPr>
-        <w:t xml:space="preserve"> file SQL để tự động tạo database khi container chạy lần đầu tiên.</w:t>
-      </w:r>
-    </w:p>
-    <w:p>
-      <w:pPr>
-        <w:jc w:val="both"/>
-        <w:rPr>
-          <w:rFonts w:ascii="Times New Roman" w:hAnsi="Times New Roman" w:cs="Times New Roman"/>
-          <w:sz w:val="26"/>
-          <w:szCs w:val="26"/>
-        </w:rPr>
-      </w:pPr>
-    </w:p>
-    <w:p>
-      <w:pPr>
-        <w:jc w:val="both"/>
-        <w:rPr>
-          <w:rFonts w:ascii="Times New Roman" w:hAnsi="Times New Roman" w:cs="Times New Roman"/>
-          <w:sz w:val="26"/>
-          <w:szCs w:val="26"/>
-        </w:rPr>
-      </w:pPr>
-      <w:r>
-        <w:rPr>
-          <w:rFonts w:ascii="Times New Roman" w:hAnsi="Times New Roman" w:cs="Times New Roman"/>
-          <w:sz w:val="26"/>
-          <w:szCs w:val="26"/>
-        </w:rPr>
+        <w:t>Viết Dockerfile để chạy PostgreSQL (postgres:15).</w:t>
+      </w:r>
+    </w:p>
+    <w:p>
+      <w:pPr>
+        <w:jc w:val="both"/>
+        <w:rPr>
+          <w:rFonts w:ascii="Times New Roman" w:hAnsi="Times New Roman" w:cs="Times New Roman"/>
+          <w:sz w:val="26"/>
+          <w:szCs w:val="26"/>
+        </w:rPr>
+      </w:pPr>
+      <w:r>
+        <w:rPr>
+          <w:rFonts w:ascii="Times New Roman" w:hAnsi="Times New Roman" w:cs="Times New Roman"/>
+          <w:sz w:val="26"/>
+          <w:szCs w:val="26"/>
+        </w:rPr>
+        <w:t>Thêm file SQL để tự động tạo database khi container chạy lần đầu tiên.</w:t>
+      </w:r>
+    </w:p>
+    <w:p>
+      <w:pPr>
+        <w:tabs>
+          <w:tab w:val="left" w:pos="1659"/>
+        </w:tabs>
+        <w:jc w:val="both"/>
+        <w:rPr>
+          <w:rFonts w:ascii="Times New Roman" w:hAnsi="Times New Roman" w:cs="Times New Roman"/>
+          <w:sz w:val="26"/>
+          <w:szCs w:val="26"/>
+        </w:rPr>
+      </w:pPr>
+      <w:r>
+        <w:rPr>
+          <w:rFonts w:ascii="Times New Roman" w:hAnsi="Times New Roman" w:cs="Times New Roman"/>
+          <w:sz w:val="26"/>
+          <w:szCs w:val="26"/>
+        </w:rPr>
+        <w:lastRenderedPageBreak/>
+        <w:drawing>
+          <wp:inline distT="0" distB="0" distL="0" distR="0" wp14:anchorId="014B25F3" wp14:editId="192D07BE">
+            <wp:extent cx="5943600" cy="3774440"/>
+            <wp:effectExtent l="0" t="0" r="0" b="0"/>
+            <wp:docPr id="60" name="Picture 60"/>
+            <wp:cNvGraphicFramePr>
+              <a:graphicFrameLocks xmlns:a="http://schemas.openxmlformats.org/drawingml/2006/main" noChangeAspect="1"/>
+            </wp:cNvGraphicFramePr>
+            <a:graphic xmlns:a="http://schemas.openxmlformats.org/drawingml/2006/main">
+              <a:graphicData uri="http://schemas.openxmlformats.org/drawingml/2006/picture">
+                <pic:pic xmlns:pic="http://schemas.openxmlformats.org/drawingml/2006/picture">
+                  <pic:nvPicPr>
+                    <pic:cNvPr id="1" name=""/>
+                    <pic:cNvPicPr/>
+                  </pic:nvPicPr>
+                  <pic:blipFill>
+                    <a:blip r:embed="rId65"/>
+                    <a:stretch>
+                      <a:fillRect/>
+                    </a:stretch>
+                  </pic:blipFill>
+                  <pic:spPr>
+                    <a:xfrm>
+                      <a:off x="0" y="0"/>
+                      <a:ext cx="5943600" cy="3774440"/>
+                    </a:xfrm>
+                    <a:prstGeom prst="rect">
+                      <a:avLst/>
+                    </a:prstGeom>
+                  </pic:spPr>
+                </pic:pic>
+              </a:graphicData>
+            </a:graphic>
+          </wp:inline>
+        </w:drawing>
+      </w:r>
+    </w:p>
+    <w:p>
+      <w:pPr>
+        <w:tabs>
+          <w:tab w:val="left" w:pos="1659"/>
+        </w:tabs>
+        <w:jc w:val="both"/>
+        <w:rPr>
+          <w:rFonts w:ascii="Times New Roman" w:hAnsi="Times New Roman" w:cs="Times New Roman"/>
+          <w:sz w:val="26"/>
+          <w:szCs w:val="26"/>
+        </w:rPr>
+      </w:pPr>
+      <w:r>
+        <w:rPr>
+          <w:rFonts w:ascii="Times New Roman" w:hAnsi="Times New Roman" w:cs="Times New Roman"/>
+          <w:sz w:val="26"/>
+          <w:szCs w:val="26"/>
+        </w:rPr>
+        <w:drawing>
+          <wp:inline distT="0" distB="0" distL="0" distR="0" wp14:anchorId="302C5A2E" wp14:editId="0272F8E0">
+            <wp:extent cx="5943600" cy="344805"/>
+            <wp:effectExtent l="0" t="0" r="0" b="0"/>
+            <wp:docPr id="61" name="Picture 61"/>
+            <wp:cNvGraphicFramePr>
+              <a:graphicFrameLocks xmlns:a="http://schemas.openxmlformats.org/drawingml/2006/main" noChangeAspect="1"/>
+            </wp:cNvGraphicFramePr>
+            <a:graphic xmlns:a="http://schemas.openxmlformats.org/drawingml/2006/main">
+              <a:graphicData uri="http://schemas.openxmlformats.org/drawingml/2006/picture">
+                <pic:pic xmlns:pic="http://schemas.openxmlformats.org/drawingml/2006/picture">
+                  <pic:nvPicPr>
+                    <pic:cNvPr id="1" name=""/>
+                    <pic:cNvPicPr/>
+                  </pic:nvPicPr>
+                  <pic:blipFill>
+                    <a:blip r:embed="rId66"/>
+                    <a:stretch>
+                      <a:fillRect/>
+                    </a:stretch>
+                  </pic:blipFill>
+                  <pic:spPr>
+                    <a:xfrm>
+                      <a:off x="0" y="0"/>
+                      <a:ext cx="5943600" cy="344805"/>
+                    </a:xfrm>
+                    <a:prstGeom prst="rect">
+                      <a:avLst/>
+                    </a:prstGeom>
+                  </pic:spPr>
+                </pic:pic>
+              </a:graphicData>
+            </a:graphic>
+          </wp:inline>
+        </w:drawing>
+      </w:r>
+    </w:p>
+    <w:p>
+      <w:pPr>
+        <w:pStyle w:val="ListParagraph"/>
+        <w:numPr>
+          <w:ilvl w:val="0"/>
+          <w:numId w:val="4"/>
+        </w:numPr>
+        <w:tabs>
+          <w:tab w:val="left" w:pos="1659"/>
+        </w:tabs>
+        <w:jc w:val="both"/>
+        <w:rPr>
+          <w:rFonts w:ascii="Times New Roman" w:hAnsi="Times New Roman" w:cs="Times New Roman"/>
+          <w:sz w:val="26"/>
+          <w:szCs w:val="26"/>
+        </w:rPr>
+      </w:pPr>
+      <w:r>
+        <w:rPr>
+          <w:rFonts w:ascii="Times New Roman" w:hAnsi="Times New Roman" w:cs="Times New Roman"/>
+          <w:sz w:val="26"/>
+          <w:szCs w:val="26"/>
+        </w:rPr>
+        <w:t xml:space="preserve">Kiểm tra dùng lện: </w:t>
+      </w:r>
+      <w:r>
+        <w:rPr>
+          <w:rFonts w:ascii="Times New Roman" w:hAnsi="Times New Roman" w:cs="Times New Roman"/>
+          <w:b/>
+          <w:bCs/>
+          <w:color w:val="2E74B5" w:themeColor="accent1" w:themeShade="BF"/>
+          <w:sz w:val="26"/>
+          <w:szCs w:val="26"/>
+        </w:rPr>
+        <w:t>docker exec -it postgres-container psql -U my_user -d my_database -c "SELECT * FROM users;"</w:t>
+      </w:r>
+    </w:p>
+    <w:p>
+      <w:pPr>
+        <w:tabs>
+          <w:tab w:val="left" w:pos="1659"/>
+        </w:tabs>
+        <w:jc w:val="both"/>
+        <w:rPr>
+          <w:rFonts w:ascii="Times New Roman" w:hAnsi="Times New Roman" w:cs="Times New Roman"/>
+          <w:sz w:val="26"/>
+          <w:szCs w:val="26"/>
+        </w:rPr>
+      </w:pPr>
+      <w:r>
+        <w:rPr>
+          <w:rFonts w:ascii="Times New Roman" w:hAnsi="Times New Roman" w:cs="Times New Roman"/>
+          <w:sz w:val="26"/>
+          <w:szCs w:val="26"/>
+        </w:rPr>
+        <w:drawing>
+          <wp:inline distT="0" distB="0" distL="0" distR="0" wp14:anchorId="23193DB5" wp14:editId="6CA8EAE3">
+            <wp:extent cx="5943600" cy="934720"/>
+            <wp:effectExtent l="0" t="0" r="0" b="0"/>
+            <wp:docPr id="62" name="Picture 62"/>
+            <wp:cNvGraphicFramePr>
+              <a:graphicFrameLocks xmlns:a="http://schemas.openxmlformats.org/drawingml/2006/main" noChangeAspect="1"/>
+            </wp:cNvGraphicFramePr>
+            <a:graphic xmlns:a="http://schemas.openxmlformats.org/drawingml/2006/main">
+              <a:graphicData uri="http://schemas.openxmlformats.org/drawingml/2006/picture">
+                <pic:pic xmlns:pic="http://schemas.openxmlformats.org/drawingml/2006/picture">
+                  <pic:nvPicPr>
+                    <pic:cNvPr id="1" name=""/>
+                    <pic:cNvPicPr/>
+                  </pic:nvPicPr>
+                  <pic:blipFill>
+                    <a:blip r:embed="rId67"/>
+                    <a:stretch>
+                      <a:fillRect/>
+                    </a:stretch>
+                  </pic:blipFill>
+                  <pic:spPr>
+                    <a:xfrm>
+                      <a:off x="0" y="0"/>
+                      <a:ext cx="5943600" cy="934720"/>
+                    </a:xfrm>
+                    <a:prstGeom prst="rect">
+                      <a:avLst/>
+                    </a:prstGeom>
+                  </pic:spPr>
+                </pic:pic>
+              </a:graphicData>
+            </a:graphic>
+          </wp:inline>
+        </w:drawing>
+      </w:r>
+    </w:p>
+    <w:p>
+      <w:pPr>
+        <w:tabs>
+          <w:tab w:val="left" w:pos="1659"/>
+        </w:tabs>
+        <w:jc w:val="both"/>
+        <w:rPr>
+          <w:rFonts w:ascii="Times New Roman" w:hAnsi="Times New Roman" w:cs="Times New Roman"/>
+          <w:sz w:val="26"/>
+          <w:szCs w:val="26"/>
+        </w:rPr>
+      </w:pPr>
+    </w:p>
+    <w:p>
+      <w:pPr>
+        <w:tabs>
+          <w:tab w:val="left" w:pos="1659"/>
+        </w:tabs>
+        <w:jc w:val="both"/>
+        <w:rPr>
+          <w:rFonts w:ascii="Times New Roman" w:hAnsi="Times New Roman" w:cs="Times New Roman"/>
+          <w:sz w:val="26"/>
+          <w:szCs w:val="26"/>
+        </w:rPr>
+      </w:pPr>
+    </w:p>
+    <w:p>
+      <w:pPr>
+        <w:tabs>
+          <w:tab w:val="left" w:pos="1659"/>
+        </w:tabs>
+        <w:jc w:val="both"/>
+        <w:rPr>
+          <w:rFonts w:ascii="Times New Roman" w:hAnsi="Times New Roman" w:cs="Times New Roman"/>
+          <w:sz w:val="26"/>
+          <w:szCs w:val="26"/>
+        </w:rPr>
+      </w:pPr>
+    </w:p>
+    <w:p>
+      <w:pPr>
+        <w:tabs>
+          <w:tab w:val="left" w:pos="1659"/>
+        </w:tabs>
+        <w:jc w:val="both"/>
+        <w:rPr>
+          <w:rFonts w:ascii="Times New Roman" w:hAnsi="Times New Roman" w:cs="Times New Roman"/>
+          <w:sz w:val="26"/>
+          <w:szCs w:val="26"/>
+        </w:rPr>
+      </w:pPr>
+    </w:p>
+    <w:p>
+      <w:pPr>
+        <w:tabs>
+          <w:tab w:val="left" w:pos="1659"/>
+        </w:tabs>
+        <w:jc w:val="both"/>
+        <w:rPr>
+          <w:rFonts w:ascii="Times New Roman" w:hAnsi="Times New Roman" w:cs="Times New Roman"/>
+          <w:sz w:val="26"/>
+          <w:szCs w:val="26"/>
+        </w:rPr>
+      </w:pPr>
+    </w:p>
+    <w:p>
+      <w:pPr>
+        <w:tabs>
+          <w:tab w:val="left" w:pos="1659"/>
+        </w:tabs>
+        <w:jc w:val="both"/>
+        <w:rPr>
+          <w:rFonts w:ascii="Times New Roman" w:hAnsi="Times New Roman" w:cs="Times New Roman"/>
+          <w:sz w:val="26"/>
+          <w:szCs w:val="26"/>
+        </w:rPr>
+      </w:pPr>
+    </w:p>
+    <w:p>
+      <w:pPr>
+        <w:tabs>
+          <w:tab w:val="left" w:pos="1659"/>
+        </w:tabs>
+        <w:jc w:val="both"/>
+        <w:rPr>
+          <w:rFonts w:ascii="Times New Roman" w:hAnsi="Times New Roman" w:cs="Times New Roman"/>
+          <w:sz w:val="26"/>
+          <w:szCs w:val="26"/>
+        </w:rPr>
+      </w:pPr>
+    </w:p>
+    <w:p>
+      <w:pPr>
+        <w:jc w:val="both"/>
+        <w:rPr>
+          <w:rFonts w:ascii="Times New Roman" w:hAnsi="Times New Roman" w:cs="Times New Roman"/>
+          <w:sz w:val="26"/>
+          <w:szCs w:val="26"/>
+        </w:rPr>
+      </w:pPr>
+      <w:r>
+        <w:rPr>
+          <w:rFonts w:ascii="Times New Roman" w:hAnsi="Times New Roman" w:cs="Times New Roman"/>
+          <w:sz w:val="26"/>
+          <w:szCs w:val="26"/>
+        </w:rPr>
+        <w:lastRenderedPageBreak/>
         <w:t>Bài 9: Tạo Dockerfile chạy Redis với cấu hình tùy chỉnh</w:t>
       </w:r>
     </w:p>
@@ -4085,80 +5152,209 @@
           <w:sz w:val="26"/>
           <w:szCs w:val="26"/>
         </w:rPr>
-        <w:t>Viết Dockerfile sử dụng redis</w:t>
-      </w:r>
-      <w:proofErr w:type="gramStart"/>
-      <w:r>
-        <w:rPr>
-          <w:rFonts w:ascii="Times New Roman" w:hAnsi="Times New Roman" w:cs="Times New Roman"/>
-          <w:sz w:val="26"/>
-          <w:szCs w:val="26"/>
-        </w:rPr>
-        <w:t>:latest</w:t>
-      </w:r>
-      <w:proofErr w:type="gramEnd"/>
-      <w:r>
-        <w:rPr>
-          <w:rFonts w:ascii="Times New Roman" w:hAnsi="Times New Roman" w:cs="Times New Roman"/>
-          <w:sz w:val="26"/>
-          <w:szCs w:val="26"/>
-        </w:rPr>
-        <w:t>.</w:t>
-      </w:r>
-    </w:p>
-    <w:p>
-      <w:pPr>
-        <w:jc w:val="both"/>
-        <w:rPr>
-          <w:rFonts w:ascii="Times New Roman" w:hAnsi="Times New Roman" w:cs="Times New Roman"/>
-          <w:sz w:val="26"/>
-          <w:szCs w:val="26"/>
-        </w:rPr>
-      </w:pPr>
-      <w:proofErr w:type="gramStart"/>
-      <w:r>
-        <w:rPr>
-          <w:rFonts w:ascii="Times New Roman" w:hAnsi="Times New Roman" w:cs="Times New Roman"/>
-          <w:sz w:val="26"/>
-          <w:szCs w:val="26"/>
-        </w:rPr>
-        <w:t>Thêm</w:t>
-      </w:r>
-      <w:proofErr w:type="gramEnd"/>
-      <w:r>
-        <w:rPr>
-          <w:rFonts w:ascii="Times New Roman" w:hAnsi="Times New Roman" w:cs="Times New Roman"/>
-          <w:sz w:val="26"/>
-          <w:szCs w:val="26"/>
-        </w:rPr>
-        <w:t xml:space="preserve"> file redis.conf vào container.</w:t>
-      </w:r>
-    </w:p>
-    <w:p>
-      <w:pPr>
-        <w:jc w:val="both"/>
-        <w:rPr>
-          <w:rFonts w:ascii="Times New Roman" w:hAnsi="Times New Roman" w:cs="Times New Roman"/>
-          <w:sz w:val="26"/>
-          <w:szCs w:val="26"/>
-        </w:rPr>
-      </w:pPr>
-    </w:p>
-    <w:p>
-      <w:pPr>
-        <w:jc w:val="both"/>
-        <w:rPr>
-          <w:rFonts w:ascii="Times New Roman" w:hAnsi="Times New Roman" w:cs="Times New Roman"/>
-          <w:sz w:val="26"/>
-          <w:szCs w:val="26"/>
-        </w:rPr>
-      </w:pPr>
-      <w:r>
-        <w:rPr>
-          <w:rFonts w:ascii="Times New Roman" w:hAnsi="Times New Roman" w:cs="Times New Roman"/>
-          <w:sz w:val="26"/>
-          <w:szCs w:val="26"/>
-        </w:rPr>
+        <w:t>Viết Dockerfile sử dụng redis:latest.</w:t>
+      </w:r>
+    </w:p>
+    <w:p>
+      <w:pPr>
+        <w:jc w:val="both"/>
+        <w:rPr>
+          <w:rFonts w:ascii="Times New Roman" w:hAnsi="Times New Roman" w:cs="Times New Roman"/>
+          <w:sz w:val="26"/>
+          <w:szCs w:val="26"/>
+        </w:rPr>
+      </w:pPr>
+      <w:r>
+        <w:rPr>
+          <w:rFonts w:ascii="Times New Roman" w:hAnsi="Times New Roman" w:cs="Times New Roman"/>
+          <w:sz w:val="26"/>
+          <w:szCs w:val="26"/>
+        </w:rPr>
+        <w:t>Thêm file redis.conf vào container.</w:t>
+      </w:r>
+    </w:p>
+    <w:p>
+      <w:pPr>
+        <w:jc w:val="both"/>
+        <w:rPr>
+          <w:rFonts w:ascii="Times New Roman" w:hAnsi="Times New Roman" w:cs="Times New Roman"/>
+          <w:sz w:val="26"/>
+          <w:szCs w:val="26"/>
+        </w:rPr>
+      </w:pPr>
+      <w:r>
+        <w:rPr>
+          <w:rFonts w:ascii="Times New Roman" w:hAnsi="Times New Roman" w:cs="Times New Roman"/>
+          <w:sz w:val="26"/>
+          <w:szCs w:val="26"/>
+        </w:rPr>
+        <w:drawing>
+          <wp:inline distT="0" distB="0" distL="0" distR="0" wp14:anchorId="7CDC6F99" wp14:editId="76A82ECA">
+            <wp:extent cx="5943600" cy="3808730"/>
+            <wp:effectExtent l="0" t="0" r="0" b="1270"/>
+            <wp:docPr id="63" name="Picture 63"/>
+            <wp:cNvGraphicFramePr>
+              <a:graphicFrameLocks xmlns:a="http://schemas.openxmlformats.org/drawingml/2006/main" noChangeAspect="1"/>
+            </wp:cNvGraphicFramePr>
+            <a:graphic xmlns:a="http://schemas.openxmlformats.org/drawingml/2006/main">
+              <a:graphicData uri="http://schemas.openxmlformats.org/drawingml/2006/picture">
+                <pic:pic xmlns:pic="http://schemas.openxmlformats.org/drawingml/2006/picture">
+                  <pic:nvPicPr>
+                    <pic:cNvPr id="1" name=""/>
+                    <pic:cNvPicPr/>
+                  </pic:nvPicPr>
+                  <pic:blipFill>
+                    <a:blip r:embed="rId68"/>
+                    <a:stretch>
+                      <a:fillRect/>
+                    </a:stretch>
+                  </pic:blipFill>
+                  <pic:spPr>
+                    <a:xfrm>
+                      <a:off x="0" y="0"/>
+                      <a:ext cx="5943600" cy="3808730"/>
+                    </a:xfrm>
+                    <a:prstGeom prst="rect">
+                      <a:avLst/>
+                    </a:prstGeom>
+                  </pic:spPr>
+                </pic:pic>
+              </a:graphicData>
+            </a:graphic>
+          </wp:inline>
+        </w:drawing>
+      </w:r>
+    </w:p>
+    <w:p>
+      <w:pPr>
+        <w:jc w:val="both"/>
+        <w:rPr>
+          <w:rFonts w:ascii="Times New Roman" w:hAnsi="Times New Roman" w:cs="Times New Roman"/>
+          <w:sz w:val="26"/>
+          <w:szCs w:val="26"/>
+        </w:rPr>
+      </w:pPr>
+      <w:r>
+        <w:rPr>
+          <w:rFonts w:ascii="Times New Roman" w:hAnsi="Times New Roman" w:cs="Times New Roman"/>
+          <w:sz w:val="26"/>
+          <w:szCs w:val="26"/>
+        </w:rPr>
+        <w:drawing>
+          <wp:inline distT="0" distB="0" distL="0" distR="0" wp14:anchorId="75193985" wp14:editId="06112BAA">
+            <wp:extent cx="5943600" cy="394335"/>
+            <wp:effectExtent l="0" t="0" r="0" b="5715"/>
+            <wp:docPr id="64" name="Picture 64"/>
+            <wp:cNvGraphicFramePr>
+              <a:graphicFrameLocks xmlns:a="http://schemas.openxmlformats.org/drawingml/2006/main" noChangeAspect="1"/>
+            </wp:cNvGraphicFramePr>
+            <a:graphic xmlns:a="http://schemas.openxmlformats.org/drawingml/2006/main">
+              <a:graphicData uri="http://schemas.openxmlformats.org/drawingml/2006/picture">
+                <pic:pic xmlns:pic="http://schemas.openxmlformats.org/drawingml/2006/picture">
+                  <pic:nvPicPr>
+                    <pic:cNvPr id="1" name=""/>
+                    <pic:cNvPicPr/>
+                  </pic:nvPicPr>
+                  <pic:blipFill>
+                    <a:blip r:embed="rId69"/>
+                    <a:stretch>
+                      <a:fillRect/>
+                    </a:stretch>
+                  </pic:blipFill>
+                  <pic:spPr>
+                    <a:xfrm>
+                      <a:off x="0" y="0"/>
+                      <a:ext cx="5943600" cy="394335"/>
+                    </a:xfrm>
+                    <a:prstGeom prst="rect">
+                      <a:avLst/>
+                    </a:prstGeom>
+                  </pic:spPr>
+                </pic:pic>
+              </a:graphicData>
+            </a:graphic>
+          </wp:inline>
+        </w:drawing>
+      </w:r>
+    </w:p>
+    <w:p>
+      <w:pPr>
+        <w:jc w:val="both"/>
+        <w:rPr>
+          <w:rFonts w:ascii="Times New Roman" w:hAnsi="Times New Roman" w:cs="Times New Roman"/>
+          <w:sz w:val="26"/>
+          <w:szCs w:val="26"/>
+        </w:rPr>
+      </w:pPr>
+      <w:r>
+        <w:rPr>
+          <w:rFonts w:ascii="Times New Roman" w:hAnsi="Times New Roman" w:cs="Times New Roman"/>
+          <w:sz w:val="26"/>
+          <w:szCs w:val="26"/>
+        </w:rPr>
+        <w:drawing>
+          <wp:inline distT="0" distB="0" distL="0" distR="0" wp14:anchorId="1CE91273" wp14:editId="2CCC6A05">
+            <wp:extent cx="5943600" cy="2044700"/>
+            <wp:effectExtent l="0" t="0" r="0" b="0"/>
+            <wp:docPr id="65" name="Picture 65"/>
+            <wp:cNvGraphicFramePr>
+              <a:graphicFrameLocks xmlns:a="http://schemas.openxmlformats.org/drawingml/2006/main" noChangeAspect="1"/>
+            </wp:cNvGraphicFramePr>
+            <a:graphic xmlns:a="http://schemas.openxmlformats.org/drawingml/2006/main">
+              <a:graphicData uri="http://schemas.openxmlformats.org/drawingml/2006/picture">
+                <pic:pic xmlns:pic="http://schemas.openxmlformats.org/drawingml/2006/picture">
+                  <pic:nvPicPr>
+                    <pic:cNvPr id="1" name=""/>
+                    <pic:cNvPicPr/>
+                  </pic:nvPicPr>
+                  <pic:blipFill>
+                    <a:blip r:embed="rId70"/>
+                    <a:stretch>
+                      <a:fillRect/>
+                    </a:stretch>
+                  </pic:blipFill>
+                  <pic:spPr>
+                    <a:xfrm>
+                      <a:off x="0" y="0"/>
+                      <a:ext cx="5943600" cy="2044700"/>
+                    </a:xfrm>
+                    <a:prstGeom prst="rect">
+                      <a:avLst/>
+                    </a:prstGeom>
+                  </pic:spPr>
+                </pic:pic>
+              </a:graphicData>
+            </a:graphic>
+          </wp:inline>
+        </w:drawing>
+      </w:r>
+    </w:p>
+    <w:p>
+      <w:pPr>
+        <w:jc w:val="both"/>
+        <w:rPr>
+          <w:rFonts w:ascii="Times New Roman" w:hAnsi="Times New Roman" w:cs="Times New Roman"/>
+          <w:sz w:val="26"/>
+          <w:szCs w:val="26"/>
+        </w:rPr>
+      </w:pPr>
+    </w:p>
+    <w:p>
+      <w:pPr>
+        <w:jc w:val="both"/>
+        <w:rPr>
+          <w:rFonts w:ascii="Times New Roman" w:hAnsi="Times New Roman" w:cs="Times New Roman"/>
+          <w:sz w:val="26"/>
+          <w:szCs w:val="26"/>
+        </w:rPr>
+      </w:pPr>
+      <w:r>
+        <w:rPr>
+          <w:rFonts w:ascii="Times New Roman" w:hAnsi="Times New Roman" w:cs="Times New Roman"/>
+          <w:sz w:val="26"/>
+          <w:szCs w:val="26"/>
+        </w:rPr>
+        <w:lastRenderedPageBreak/>
         <w:t>Bài 10: Chạy ứng dụng PHP với Apache</w:t>
       </w:r>
     </w:p>
@@ -4195,25 +5391,7 @@
           <w:sz w:val="26"/>
           <w:szCs w:val="26"/>
         </w:rPr>
-        <w:t>Viết Dockerfile để chạy một ứng dụng PHP đơn giản (php</w:t>
-      </w:r>
-      <w:proofErr w:type="gramStart"/>
-      <w:r>
-        <w:rPr>
-          <w:rFonts w:ascii="Times New Roman" w:hAnsi="Times New Roman" w:cs="Times New Roman"/>
-          <w:sz w:val="26"/>
-          <w:szCs w:val="26"/>
-        </w:rPr>
-        <w:t>:8.2</w:t>
-      </w:r>
-      <w:proofErr w:type="gramEnd"/>
-      <w:r>
-        <w:rPr>
-          <w:rFonts w:ascii="Times New Roman" w:hAnsi="Times New Roman" w:cs="Times New Roman"/>
-          <w:sz w:val="26"/>
-          <w:szCs w:val="26"/>
-        </w:rPr>
-        <w:t>-apache).</w:t>
+        <w:t>Viết Dockerfile để chạy một ứng dụng PHP đơn giản (php:8.2-apache).</w:t>
       </w:r>
     </w:p>
     <w:p>
@@ -4232,6 +5410,162 @@
           <w:szCs w:val="26"/>
         </w:rPr>
         <w:t>Mount mã nguồn từ máy host vào container.</w:t>
+      </w:r>
+    </w:p>
+    <w:p>
+      <w:pPr>
+        <w:jc w:val="both"/>
+        <w:rPr>
+          <w:rFonts w:ascii="Times New Roman" w:hAnsi="Times New Roman" w:cs="Times New Roman"/>
+          <w:sz w:val="26"/>
+          <w:szCs w:val="26"/>
+        </w:rPr>
+      </w:pPr>
+      <w:r>
+        <w:rPr>
+          <w:rFonts w:ascii="Times New Roman" w:hAnsi="Times New Roman" w:cs="Times New Roman"/>
+          <w:sz w:val="26"/>
+          <w:szCs w:val="26"/>
+        </w:rPr>
+        <w:drawing>
+          <wp:inline distT="0" distB="0" distL="0" distR="0" wp14:anchorId="1A9BA7FD" wp14:editId="48A11926">
+            <wp:extent cx="5943600" cy="3772535"/>
+            <wp:effectExtent l="0" t="0" r="0" b="0"/>
+            <wp:docPr id="66" name="Picture 66"/>
+            <wp:cNvGraphicFramePr>
+              <a:graphicFrameLocks xmlns:a="http://schemas.openxmlformats.org/drawingml/2006/main" noChangeAspect="1"/>
+            </wp:cNvGraphicFramePr>
+            <a:graphic xmlns:a="http://schemas.openxmlformats.org/drawingml/2006/main">
+              <a:graphicData uri="http://schemas.openxmlformats.org/drawingml/2006/picture">
+                <pic:pic xmlns:pic="http://schemas.openxmlformats.org/drawingml/2006/picture">
+                  <pic:nvPicPr>
+                    <pic:cNvPr id="1" name=""/>
+                    <pic:cNvPicPr/>
+                  </pic:nvPicPr>
+                  <pic:blipFill>
+                    <a:blip r:embed="rId71"/>
+                    <a:stretch>
+                      <a:fillRect/>
+                    </a:stretch>
+                  </pic:blipFill>
+                  <pic:spPr>
+                    <a:xfrm>
+                      <a:off x="0" y="0"/>
+                      <a:ext cx="5943600" cy="3772535"/>
+                    </a:xfrm>
+                    <a:prstGeom prst="rect">
+                      <a:avLst/>
+                    </a:prstGeom>
+                  </pic:spPr>
+                </pic:pic>
+              </a:graphicData>
+            </a:graphic>
+          </wp:inline>
+        </w:drawing>
+      </w:r>
+    </w:p>
+    <w:p>
+      <w:pPr>
+        <w:jc w:val="both"/>
+        <w:rPr>
+          <w:rFonts w:ascii="Times New Roman" w:hAnsi="Times New Roman" w:cs="Times New Roman"/>
+          <w:sz w:val="26"/>
+          <w:szCs w:val="26"/>
+        </w:rPr>
+      </w:pPr>
+      <w:r>
+        <w:rPr>
+          <w:rFonts w:ascii="Times New Roman" w:hAnsi="Times New Roman" w:cs="Times New Roman"/>
+          <w:sz w:val="26"/>
+          <w:szCs w:val="26"/>
+        </w:rPr>
+        <w:drawing>
+          <wp:inline distT="0" distB="0" distL="0" distR="0" wp14:anchorId="33351459" wp14:editId="373E2884">
+            <wp:extent cx="5943600" cy="374650"/>
+            <wp:effectExtent l="0" t="0" r="0" b="6350"/>
+            <wp:docPr id="67" name="Picture 67"/>
+            <wp:cNvGraphicFramePr>
+              <a:graphicFrameLocks xmlns:a="http://schemas.openxmlformats.org/drawingml/2006/main" noChangeAspect="1"/>
+            </wp:cNvGraphicFramePr>
+            <a:graphic xmlns:a="http://schemas.openxmlformats.org/drawingml/2006/main">
+              <a:graphicData uri="http://schemas.openxmlformats.org/drawingml/2006/picture">
+                <pic:pic xmlns:pic="http://schemas.openxmlformats.org/drawingml/2006/picture">
+                  <pic:nvPicPr>
+                    <pic:cNvPr id="1" name=""/>
+                    <pic:cNvPicPr/>
+                  </pic:nvPicPr>
+                  <pic:blipFill>
+                    <a:blip r:embed="rId72"/>
+                    <a:stretch>
+                      <a:fillRect/>
+                    </a:stretch>
+                  </pic:blipFill>
+                  <pic:spPr>
+                    <a:xfrm>
+                      <a:off x="0" y="0"/>
+                      <a:ext cx="5943600" cy="374650"/>
+                    </a:xfrm>
+                    <a:prstGeom prst="rect">
+                      <a:avLst/>
+                    </a:prstGeom>
+                  </pic:spPr>
+                </pic:pic>
+              </a:graphicData>
+            </a:graphic>
+          </wp:inline>
+        </w:drawing>
+      </w:r>
+    </w:p>
+    <w:p>
+      <w:pPr>
+        <w:jc w:val="both"/>
+        <w:rPr>
+          <w:rFonts w:ascii="Times New Roman" w:hAnsi="Times New Roman" w:cs="Times New Roman"/>
+          <w:sz w:val="26"/>
+          <w:szCs w:val="26"/>
+        </w:rPr>
+      </w:pPr>
+      <w:r>
+        <w:rPr>
+          <w:rFonts w:ascii="Times New Roman" w:hAnsi="Times New Roman" w:cs="Times New Roman"/>
+          <w:sz w:val="26"/>
+          <w:szCs w:val="26"/>
+        </w:rPr>
+        <w:drawing>
+          <wp:inline distT="0" distB="0" distL="0" distR="0" wp14:anchorId="074C3C06" wp14:editId="72115444">
+            <wp:extent cx="5943600" cy="1418590"/>
+            <wp:effectExtent l="0" t="0" r="0" b="0"/>
+            <wp:docPr id="68" name="Picture 68"/>
+            <wp:cNvGraphicFramePr>
+              <a:graphicFrameLocks xmlns:a="http://schemas.openxmlformats.org/drawingml/2006/main" noChangeAspect="1"/>
+            </wp:cNvGraphicFramePr>
+            <a:graphic xmlns:a="http://schemas.openxmlformats.org/drawingml/2006/main">
+              <a:graphicData uri="http://schemas.openxmlformats.org/drawingml/2006/picture">
+                <pic:pic xmlns:pic="http://schemas.openxmlformats.org/drawingml/2006/picture">
+                  <pic:nvPicPr>
+                    <pic:cNvPr id="1" name=""/>
+                    <pic:cNvPicPr/>
+                  </pic:nvPicPr>
+                  <pic:blipFill>
+                    <a:blip r:embed="rId73"/>
+                    <a:stretch>
+                      <a:fillRect/>
+                    </a:stretch>
+                  </pic:blipFill>
+                  <pic:spPr>
+                    <a:xfrm>
+                      <a:off x="0" y="0"/>
+                      <a:ext cx="5943600" cy="1418590"/>
+                    </a:xfrm>
+                    <a:prstGeom prst="rect">
+                      <a:avLst/>
+                    </a:prstGeom>
+                  </pic:spPr>
+                </pic:pic>
+              </a:graphicData>
+            </a:graphic>
+          </wp:inline>
+        </w:drawing>
       </w:r>
     </w:p>
     <w:sectPr>
@@ -4245,7 +5579,7 @@
 </file>
 
 <file path=word/endnotes.xml><?xml version="1.0" encoding="utf-8"?>
-<w:endnotes xmlns:wpc="http://schemas.microsoft.com/office/word/2010/wordprocessingCanvas" xmlns:mc="http://schemas.openxmlformats.org/markup-compatibility/2006" xmlns:o="urn:schemas-microsoft-com:office:office" xmlns:r="http://schemas.openxmlformats.org/officeDocument/2006/relationships" xmlns:m="http://schemas.openxmlformats.org/officeDocument/2006/math" xmlns:v="urn:schemas-microsoft-com:vml" xmlns:wp14="http://schemas.microsoft.com/office/word/2010/wordprocessingDrawing" xmlns:wp="http://schemas.openxmlformats.org/drawingml/2006/wordprocessingDrawing" xmlns:w10="urn:schemas-microsoft-com:office:word" xmlns:w="http://schemas.openxmlformats.org/wordprocessingml/2006/main" xmlns:w14="http://schemas.microsoft.com/office/word/2010/wordml" xmlns:w15="http://schemas.microsoft.com/office/word/2012/wordml" xmlns:wpg="http://schemas.microsoft.com/office/word/2010/wordprocessingGroup" xmlns:wpi="http://schemas.microsoft.com/office/word/2010/wordprocessingInk" xmlns:wne="http://schemas.microsoft.com/office/word/2006/wordml" xmlns:wps="http://schemas.microsoft.com/office/word/2010/wordprocessingShape" mc:Ignorable="w14 w15 wp14">
+<w:endnotes xmlns:wpc="http://schemas.microsoft.com/office/word/2010/wordprocessingCanvas" xmlns:cx="http://schemas.microsoft.com/office/drawing/2014/chartex" xmlns:cx1="http://schemas.microsoft.com/office/drawing/2015/9/8/chartex" xmlns:cx2="http://schemas.microsoft.com/office/drawing/2015/10/21/chartex" xmlns:cx3="http://schemas.microsoft.com/office/drawing/2016/5/9/chartex" xmlns:cx4="http://schemas.microsoft.com/office/drawing/2016/5/10/chartex" xmlns:cx5="http://schemas.microsoft.com/office/drawing/2016/5/11/chartex" xmlns:cx6="http://schemas.microsoft.com/office/drawing/2016/5/12/chartex" xmlns:cx7="http://schemas.microsoft.com/office/drawing/2016/5/13/chartex" xmlns:cx8="http://schemas.microsoft.com/office/drawing/2016/5/14/chartex" xmlns:mc="http://schemas.openxmlformats.org/markup-compatibility/2006" xmlns:aink="http://schemas.microsoft.com/office/drawing/2016/ink" xmlns:am3d="http://schemas.microsoft.com/office/drawing/2017/model3d" xmlns:o="urn:schemas-microsoft-com:office:office" xmlns:oel="http://schemas.microsoft.com/office/2019/extlst" xmlns:r="http://schemas.openxmlformats.org/officeDocument/2006/relationships" xmlns:m="http://schemas.openxmlformats.org/officeDocument/2006/math" xmlns:v="urn:schemas-microsoft-com:vml" xmlns:wp14="http://schemas.microsoft.com/office/word/2010/wordprocessingDrawing" xmlns:wp="http://schemas.openxmlformats.org/drawingml/2006/wordprocessingDrawing" xmlns:w10="urn:schemas-microsoft-com:office:word" xmlns:w="http://schemas.openxmlformats.org/wordprocessingml/2006/main" xmlns:w14="http://schemas.microsoft.com/office/word/2010/wordml" xmlns:w15="http://schemas.microsoft.com/office/word/2012/wordml" xmlns:w16cex="http://schemas.microsoft.com/office/word/2018/wordml/cex" xmlns:w16cid="http://schemas.microsoft.com/office/word/2016/wordml/cid" xmlns:w16="http://schemas.microsoft.com/office/word/2018/wordml" xmlns:w16sdtdh="http://schemas.microsoft.com/office/word/2020/wordml/sdtdatahash" xmlns:w16se="http://schemas.microsoft.com/office/word/2015/wordml/symex" xmlns:wpg="http://schemas.microsoft.com/office/word/2010/wordprocessingGroup" xmlns:wpi="http://schemas.microsoft.com/office/word/2010/wordprocessingInk" xmlns:wne="http://schemas.microsoft.com/office/word/2006/wordml" xmlns:wps="http://schemas.microsoft.com/office/word/2010/wordprocessingShape" mc:Ignorable="w14 w15 w16se w16cid w16 w16cex w16sdtdh wp14">
   <w:endnote w:type="separator" w:id="-1">
     <w:p>
       <w:pPr>
@@ -4270,7 +5604,7 @@
 </file>
 
 <file path=word/footnotes.xml><?xml version="1.0" encoding="utf-8"?>
-<w:footnotes xmlns:wpc="http://schemas.microsoft.com/office/word/2010/wordprocessingCanvas" xmlns:mc="http://schemas.openxmlformats.org/markup-compatibility/2006" xmlns:o="urn:schemas-microsoft-com:office:office" xmlns:r="http://schemas.openxmlformats.org/officeDocument/2006/relationships" xmlns:m="http://schemas.openxmlformats.org/officeDocument/2006/math" xmlns:v="urn:schemas-microsoft-com:vml" xmlns:wp14="http://schemas.microsoft.com/office/word/2010/wordprocessingDrawing" xmlns:wp="http://schemas.openxmlformats.org/drawingml/2006/wordprocessingDrawing" xmlns:w10="urn:schemas-microsoft-com:office:word" xmlns:w="http://schemas.openxmlformats.org/wordprocessingml/2006/main" xmlns:w14="http://schemas.microsoft.com/office/word/2010/wordml" xmlns:w15="http://schemas.microsoft.com/office/word/2012/wordml" xmlns:wpg="http://schemas.microsoft.com/office/word/2010/wordprocessingGroup" xmlns:wpi="http://schemas.microsoft.com/office/word/2010/wordprocessingInk" xmlns:wne="http://schemas.microsoft.com/office/word/2006/wordml" xmlns:wps="http://schemas.microsoft.com/office/word/2010/wordprocessingShape" mc:Ignorable="w14 w15 wp14">
+<w:footnotes xmlns:wpc="http://schemas.microsoft.com/office/word/2010/wordprocessingCanvas" xmlns:cx="http://schemas.microsoft.com/office/drawing/2014/chartex" xmlns:cx1="http://schemas.microsoft.com/office/drawing/2015/9/8/chartex" xmlns:cx2="http://schemas.microsoft.com/office/drawing/2015/10/21/chartex" xmlns:cx3="http://schemas.microsoft.com/office/drawing/2016/5/9/chartex" xmlns:cx4="http://schemas.microsoft.com/office/drawing/2016/5/10/chartex" xmlns:cx5="http://schemas.microsoft.com/office/drawing/2016/5/11/chartex" xmlns:cx6="http://schemas.microsoft.com/office/drawing/2016/5/12/chartex" xmlns:cx7="http://schemas.microsoft.com/office/drawing/2016/5/13/chartex" xmlns:cx8="http://schemas.microsoft.com/office/drawing/2016/5/14/chartex" xmlns:mc="http://schemas.openxmlformats.org/markup-compatibility/2006" xmlns:aink="http://schemas.microsoft.com/office/drawing/2016/ink" xmlns:am3d="http://schemas.microsoft.com/office/drawing/2017/model3d" xmlns:o="urn:schemas-microsoft-com:office:office" xmlns:oel="http://schemas.microsoft.com/office/2019/extlst" xmlns:r="http://schemas.openxmlformats.org/officeDocument/2006/relationships" xmlns:m="http://schemas.openxmlformats.org/officeDocument/2006/math" xmlns:v="urn:schemas-microsoft-com:vml" xmlns:wp14="http://schemas.microsoft.com/office/word/2010/wordprocessingDrawing" xmlns:wp="http://schemas.openxmlformats.org/drawingml/2006/wordprocessingDrawing" xmlns:w10="urn:schemas-microsoft-com:office:word" xmlns:w="http://schemas.openxmlformats.org/wordprocessingml/2006/main" xmlns:w14="http://schemas.microsoft.com/office/word/2010/wordml" xmlns:w15="http://schemas.microsoft.com/office/word/2012/wordml" xmlns:w16cex="http://schemas.microsoft.com/office/word/2018/wordml/cex" xmlns:w16cid="http://schemas.microsoft.com/office/word/2016/wordml/cid" xmlns:w16="http://schemas.microsoft.com/office/word/2018/wordml" xmlns:w16sdtdh="http://schemas.microsoft.com/office/word/2020/wordml/sdtdatahash" xmlns:w16se="http://schemas.microsoft.com/office/word/2015/wordml/symex" xmlns:wpg="http://schemas.microsoft.com/office/word/2010/wordprocessingGroup" xmlns:wpi="http://schemas.microsoft.com/office/word/2010/wordprocessingInk" xmlns:wne="http://schemas.microsoft.com/office/word/2006/wordml" xmlns:wps="http://schemas.microsoft.com/office/word/2010/wordprocessingShape" mc:Ignorable="w14 w15 w16se w16cid w16 w16cex w16sdtdh wp14">
   <w:footnote w:type="separator" w:id="-1">
     <w:p>
       <w:pPr>
@@ -4295,8 +5629,120 @@
 </file>
 
 <file path=word/numbering.xml><?xml version="1.0" encoding="utf-8"?>
-<w:numbering xmlns:wpc="http://schemas.microsoft.com/office/word/2010/wordprocessingCanvas" xmlns:mc="http://schemas.openxmlformats.org/markup-compatibility/2006" xmlns:o="urn:schemas-microsoft-com:office:office" xmlns:r="http://schemas.openxmlformats.org/officeDocument/2006/relationships" xmlns:m="http://schemas.openxmlformats.org/officeDocument/2006/math" xmlns:v="urn:schemas-microsoft-com:vml" xmlns:wp14="http://schemas.microsoft.com/office/word/2010/wordprocessingDrawing" xmlns:wp="http://schemas.openxmlformats.org/drawingml/2006/wordprocessingDrawing" xmlns:w10="urn:schemas-microsoft-com:office:word" xmlns:w="http://schemas.openxmlformats.org/wordprocessingml/2006/main" xmlns:w14="http://schemas.microsoft.com/office/word/2010/wordml" xmlns:w15="http://schemas.microsoft.com/office/word/2012/wordml" xmlns:wpg="http://schemas.microsoft.com/office/word/2010/wordprocessingGroup" xmlns:wpi="http://schemas.microsoft.com/office/word/2010/wordprocessingInk" xmlns:wne="http://schemas.microsoft.com/office/word/2006/wordml" xmlns:wps="http://schemas.microsoft.com/office/word/2010/wordprocessingShape" mc:Ignorable="w14 w15 wp14">
-  <w:abstractNum w:abstractNumId="0">
+<w:numbering xmlns:wpc="http://schemas.microsoft.com/office/word/2010/wordprocessingCanvas" xmlns:cx="http://schemas.microsoft.com/office/drawing/2014/chartex" xmlns:cx1="http://schemas.microsoft.com/office/drawing/2015/9/8/chartex" xmlns:cx2="http://schemas.microsoft.com/office/drawing/2015/10/21/chartex" xmlns:cx3="http://schemas.microsoft.com/office/drawing/2016/5/9/chartex" xmlns:cx4="http://schemas.microsoft.com/office/drawing/2016/5/10/chartex" xmlns:cx5="http://schemas.microsoft.com/office/drawing/2016/5/11/chartex" xmlns:cx6="http://schemas.microsoft.com/office/drawing/2016/5/12/chartex" xmlns:cx7="http://schemas.microsoft.com/office/drawing/2016/5/13/chartex" xmlns:cx8="http://schemas.microsoft.com/office/drawing/2016/5/14/chartex" xmlns:mc="http://schemas.openxmlformats.org/markup-compatibility/2006" xmlns:aink="http://schemas.microsoft.com/office/drawing/2016/ink" xmlns:am3d="http://schemas.microsoft.com/office/drawing/2017/model3d" xmlns:o="urn:schemas-microsoft-com:office:office" xmlns:oel="http://schemas.microsoft.com/office/2019/extlst" xmlns:r="http://schemas.openxmlformats.org/officeDocument/2006/relationships" xmlns:m="http://schemas.openxmlformats.org/officeDocument/2006/math" xmlns:v="urn:schemas-microsoft-com:vml" xmlns:wp14="http://schemas.microsoft.com/office/word/2010/wordprocessingDrawing" xmlns:wp="http://schemas.openxmlformats.org/drawingml/2006/wordprocessingDrawing" xmlns:w10="urn:schemas-microsoft-com:office:word" xmlns:w="http://schemas.openxmlformats.org/wordprocessingml/2006/main" xmlns:w14="http://schemas.microsoft.com/office/word/2010/wordml" xmlns:w15="http://schemas.microsoft.com/office/word/2012/wordml" xmlns:w16cex="http://schemas.microsoft.com/office/word/2018/wordml/cex" xmlns:w16cid="http://schemas.microsoft.com/office/word/2016/wordml/cid" xmlns:w16="http://schemas.microsoft.com/office/word/2018/wordml" xmlns:w16sdtdh="http://schemas.microsoft.com/office/word/2020/wordml/sdtdatahash" xmlns:w16se="http://schemas.microsoft.com/office/word/2015/wordml/symex" xmlns:wpg="http://schemas.microsoft.com/office/word/2010/wordprocessingGroup" xmlns:wpi="http://schemas.microsoft.com/office/word/2010/wordprocessingInk" xmlns:wne="http://schemas.microsoft.com/office/word/2006/wordml" xmlns:wps="http://schemas.microsoft.com/office/word/2010/wordprocessingShape" mc:Ignorable="w14 w15 w16se w16cid w16 w16cex w16sdtdh wp14">
+  <w:abstractNum w:abstractNumId="0" w15:restartNumberingAfterBreak="0">
+    <w:nsid w:val="22C8795E"/>
+    <w:multiLevelType w:val="hybridMultilevel"/>
+    <w:tmpl w:val="C8B44E3A"/>
+    <w:lvl w:ilvl="0" w:tplc="44AE2444">
+      <w:numFmt w:val="bullet"/>
+      <w:lvlText w:val="-"/>
+      <w:lvlJc w:val="left"/>
+      <w:pPr>
+        <w:ind w:left="720" w:hanging="360"/>
+      </w:pPr>
+      <w:rPr>
+        <w:rFonts w:ascii="Times New Roman" w:eastAsiaTheme="minorHAnsi" w:hAnsi="Times New Roman" w:cs="Times New Roman" w:hint="default"/>
+      </w:rPr>
+    </w:lvl>
+    <w:lvl w:ilvl="1" w:tplc="04090003" w:tentative="1">
+      <w:start w:val="1"/>
+      <w:numFmt w:val="bullet"/>
+      <w:lvlText w:val="o"/>
+      <w:lvlJc w:val="left"/>
+      <w:pPr>
+        <w:ind w:left="1440" w:hanging="360"/>
+      </w:pPr>
+      <w:rPr>
+        <w:rFonts w:ascii="Courier New" w:hAnsi="Courier New" w:cs="Courier New" w:hint="default"/>
+      </w:rPr>
+    </w:lvl>
+    <w:lvl w:ilvl="2" w:tplc="04090005" w:tentative="1">
+      <w:start w:val="1"/>
+      <w:numFmt w:val="bullet"/>
+      <w:lvlText w:val=""/>
+      <w:lvlJc w:val="left"/>
+      <w:pPr>
+        <w:ind w:left="2160" w:hanging="360"/>
+      </w:pPr>
+      <w:rPr>
+        <w:rFonts w:ascii="Wingdings" w:hAnsi="Wingdings" w:hint="default"/>
+      </w:rPr>
+    </w:lvl>
+    <w:lvl w:ilvl="3" w:tplc="04090001" w:tentative="1">
+      <w:start w:val="1"/>
+      <w:numFmt w:val="bullet"/>
+      <w:lvlText w:val=""/>
+      <w:lvlJc w:val="left"/>
+      <w:pPr>
+        <w:ind w:left="2880" w:hanging="360"/>
+      </w:pPr>
+      <w:rPr>
+        <w:rFonts w:ascii="Symbol" w:hAnsi="Symbol" w:hint="default"/>
+      </w:rPr>
+    </w:lvl>
+    <w:lvl w:ilvl="4" w:tplc="04090003" w:tentative="1">
+      <w:start w:val="1"/>
+      <w:numFmt w:val="bullet"/>
+      <w:lvlText w:val="o"/>
+      <w:lvlJc w:val="left"/>
+      <w:pPr>
+        <w:ind w:left="3600" w:hanging="360"/>
+      </w:pPr>
+      <w:rPr>
+        <w:rFonts w:ascii="Courier New" w:hAnsi="Courier New" w:cs="Courier New" w:hint="default"/>
+      </w:rPr>
+    </w:lvl>
+    <w:lvl w:ilvl="5" w:tplc="04090005" w:tentative="1">
+      <w:start w:val="1"/>
+      <w:numFmt w:val="bullet"/>
+      <w:lvlText w:val=""/>
+      <w:lvlJc w:val="left"/>
+      <w:pPr>
+        <w:ind w:left="4320" w:hanging="360"/>
+      </w:pPr>
+      <w:rPr>
+        <w:rFonts w:ascii="Wingdings" w:hAnsi="Wingdings" w:hint="default"/>
+      </w:rPr>
+    </w:lvl>
+    <w:lvl w:ilvl="6" w:tplc="04090001" w:tentative="1">
+      <w:start w:val="1"/>
+      <w:numFmt w:val="bullet"/>
+      <w:lvlText w:val=""/>
+      <w:lvlJc w:val="left"/>
+      <w:pPr>
+        <w:ind w:left="5040" w:hanging="360"/>
+      </w:pPr>
+      <w:rPr>
+        <w:rFonts w:ascii="Symbol" w:hAnsi="Symbol" w:hint="default"/>
+      </w:rPr>
+    </w:lvl>
+    <w:lvl w:ilvl="7" w:tplc="04090003" w:tentative="1">
+      <w:start w:val="1"/>
+      <w:numFmt w:val="bullet"/>
+      <w:lvlText w:val="o"/>
+      <w:lvlJc w:val="left"/>
+      <w:pPr>
+        <w:ind w:left="5760" w:hanging="360"/>
+      </w:pPr>
+      <w:rPr>
+        <w:rFonts w:ascii="Courier New" w:hAnsi="Courier New" w:cs="Courier New" w:hint="default"/>
+      </w:rPr>
+    </w:lvl>
+    <w:lvl w:ilvl="8" w:tplc="04090005" w:tentative="1">
+      <w:start w:val="1"/>
+      <w:numFmt w:val="bullet"/>
+      <w:lvlText w:val=""/>
+      <w:lvlJc w:val="left"/>
+      <w:pPr>
+        <w:ind w:left="6480" w:hanging="360"/>
+      </w:pPr>
+      <w:rPr>
+        <w:rFonts w:ascii="Wingdings" w:hAnsi="Wingdings" w:hint="default"/>
+      </w:rPr>
+    </w:lvl>
+  </w:abstractNum>
+  <w:abstractNum w:abstractNumId="1" w15:restartNumberingAfterBreak="0">
     <w:nsid w:val="48174B05"/>
     <w:multiLevelType w:val="hybridMultilevel"/>
     <w:tmpl w:val="AFC8F864"/>
@@ -4385,7 +5831,7 @@
       </w:pPr>
     </w:lvl>
   </w:abstractNum>
-  <w:abstractNum w:abstractNumId="1">
+  <w:abstractNum w:abstractNumId="2" w15:restartNumberingAfterBreak="0">
     <w:nsid w:val="6E545AE3"/>
     <w:multiLevelType w:val="hybridMultilevel"/>
     <w:tmpl w:val="DFF4328C"/>
@@ -4471,7 +5917,7 @@
       </w:pPr>
     </w:lvl>
   </w:abstractNum>
-  <w:abstractNum w:abstractNumId="2">
+  <w:abstractNum w:abstractNumId="3" w15:restartNumberingAfterBreak="0">
     <w:nsid w:val="73902C83"/>
     <w:multiLevelType w:val="hybridMultilevel"/>
     <w:tmpl w:val="BE1CE24C"/>
@@ -4557,20 +6003,23 @@
       </w:pPr>
     </w:lvl>
   </w:abstractNum>
-  <w:num w:numId="1">
+  <w:num w:numId="1" w16cid:durableId="637691607">
+    <w:abstractNumId w:val="2"/>
+  </w:num>
+  <w:num w:numId="2" w16cid:durableId="1806728357">
     <w:abstractNumId w:val="1"/>
   </w:num>
-  <w:num w:numId="2">
+  <w:num w:numId="3" w16cid:durableId="175771331">
+    <w:abstractNumId w:val="3"/>
+  </w:num>
+  <w:num w:numId="4" w16cid:durableId="989093574">
     <w:abstractNumId w:val="0"/>
-  </w:num>
-  <w:num w:numId="3">
-    <w:abstractNumId w:val="2"/>
   </w:num>
 </w:numbering>
 </file>
 
 <file path=word/styles.xml><?xml version="1.0" encoding="utf-8"?>
-<w:styles xmlns:mc="http://schemas.openxmlformats.org/markup-compatibility/2006" xmlns:r="http://schemas.openxmlformats.org/officeDocument/2006/relationships" xmlns:w="http://schemas.openxmlformats.org/wordprocessingml/2006/main" xmlns:w14="http://schemas.microsoft.com/office/word/2010/wordml" xmlns:w15="http://schemas.microsoft.com/office/word/2012/wordml" mc:Ignorable="w14 w15">
+<w:styles xmlns:mc="http://schemas.openxmlformats.org/markup-compatibility/2006" xmlns:r="http://schemas.openxmlformats.org/officeDocument/2006/relationships" xmlns:w="http://schemas.openxmlformats.org/wordprocessingml/2006/main" xmlns:w14="http://schemas.microsoft.com/office/word/2010/wordml" xmlns:w15="http://schemas.microsoft.com/office/word/2012/wordml" xmlns:w16cex="http://schemas.microsoft.com/office/word/2018/wordml/cex" xmlns:w16cid="http://schemas.microsoft.com/office/word/2016/wordml/cid" xmlns:w16="http://schemas.microsoft.com/office/word/2018/wordml" xmlns:w16sdtdh="http://schemas.microsoft.com/office/word/2020/wordml/sdtdatahash" xmlns:w16se="http://schemas.microsoft.com/office/word/2015/wordml/symex" mc:Ignorable="w14 w15 w16se w16cid w16 w16cex w16sdtdh">
   <w:docDefaults>
     <w:rPrDefault>
       <w:rPr>
@@ -4586,7 +6035,7 @@
       </w:pPr>
     </w:pPrDefault>
   </w:docDefaults>
-  <w:latentStyles w:defLockedState="0" w:defUIPriority="99" w:defSemiHidden="0" w:defUnhideWhenUsed="0" w:defQFormat="0" w:count="371">
+  <w:latentStyles w:defLockedState="0" w:defUIPriority="99" w:defSemiHidden="0" w:defUnhideWhenUsed="0" w:defQFormat="0" w:count="376">
     <w:lsdException w:name="Normal" w:uiPriority="0" w:qFormat="1"/>
     <w:lsdException w:name="heading 1" w:uiPriority="9" w:qFormat="1"/>
     <w:lsdException w:name="heading 2" w:semiHidden="1" w:uiPriority="9" w:unhideWhenUsed="1" w:qFormat="1"/>
@@ -4958,6 +6407,11 @@
     <w:lsdException w:name="List Table 5 Dark Accent 6" w:uiPriority="50"/>
     <w:lsdException w:name="List Table 6 Colorful Accent 6" w:uiPriority="51"/>
     <w:lsdException w:name="List Table 7 Colorful Accent 6" w:uiPriority="52"/>
+    <w:lsdException w:name="Mention" w:semiHidden="1" w:unhideWhenUsed="1"/>
+    <w:lsdException w:name="Smart Hyperlink" w:semiHidden="1" w:unhideWhenUsed="1"/>
+    <w:lsdException w:name="Hashtag" w:semiHidden="1" w:unhideWhenUsed="1"/>
+    <w:lsdException w:name="Unresolved Mention" w:semiHidden="1" w:unhideWhenUsed="1"/>
+    <w:lsdException w:name="Smart Link" w:semiHidden="1" w:unhideWhenUsed="1"/>
   </w:latentStyles>
   <w:style w:type="paragraph" w:default="1" w:styleId="Normal">
     <w:name w:val="Normal"/>

</xml_diff>